<commit_message>
docs: derive labour input from code volume and fill in module names
Calendar duration times headcount is not a measure of labour input and
no time records exist, so labour is now estimated from measured code
volume against standard output norms. The cost approach and the
reconciliation follow from that base.

Co-Authored-By: Claude Opus 5 <noreply@anthropic.com>
Claude-Session: https://claude.ai/code/session_01A41GNd7NTYjRMreRZZDvYy
</commit_message>
<xml_diff>
--- a/infosreda-valuation-input.docx
+++ b/infosreda-valuation-input.docx
@@ -729,12 +729,12 @@
           <w:sz w:val="24"/>
           <w:szCs w:val="24"/>
         </w:rPr>
-        <w:t xml:space="preserve">Девять модулей. Собственные наименования модулей зарегистрированы правообладателем отдельно и подлежат внесению в таблицу ниже.</w:t>
+        <w:t xml:space="preserve">В состав программного обеспечения входят девять предметных учебных модулей. Наименования модулей принадлежат правообладателю.</w:t>
       </w:r>
     </w:p>
     <w:tbl>
       <w:tblPr>
-        <w:tblW w:w="10200" w:type="dxa"/>
+        <w:tblW w:w="10800" w:type="dxa"/>
         <w:jc w:val="start"/>
         <w:tblInd w:w="108" w:type="dxa"/>
         <w:tblLayout w:type="fixed"/>
@@ -747,9 +747,9 @@
       </w:tblPr>
       <w:tblGrid>
         <w:gridCol w:w="600"/>
-        <w:gridCol w:w="4700"/>
-        <w:gridCol w:w="2400"/>
-        <w:gridCol w:w="2500"/>
+        <w:gridCol w:w="3600"/>
+        <w:gridCol w:w="4300"/>
+        <w:gridCol w:w="2300"/>
       </w:tblGrid>
       <w:tr>
         <w:trPr>
@@ -785,7 +785,7 @@
         </w:tc>
         <w:tc>
           <w:tcPr>
-            <w:tcW w:w="4700" w:type="dxa"/>
+            <w:tcW w:w="3600" w:type="dxa"/>
             <w:tcBorders>
               <w:top w:val="single" w:sz="4" w:space="0" w:color="000000"/>
               <w:start w:val="single" w:sz="4" w:space="0" w:color="000000"/>
@@ -813,7 +813,7 @@
         </w:tc>
         <w:tc>
           <w:tcPr>
-            <w:tcW w:w="2400" w:type="dxa"/>
+            <w:tcW w:w="4300" w:type="dxa"/>
             <w:tcBorders>
               <w:top w:val="single" w:sz="4" w:space="0" w:color="000000"/>
               <w:start w:val="single" w:sz="4" w:space="0" w:color="000000"/>
@@ -841,7 +841,7 @@
         </w:tc>
         <w:tc>
           <w:tcPr>
-            <w:tcW w:w="2500" w:type="dxa"/>
+            <w:tcW w:w="2300" w:type="dxa"/>
             <w:tcBorders>
               <w:top w:val="single" w:sz="4" w:space="0" w:color="000000"/>
               <w:start w:val="single" w:sz="4" w:space="0" w:color="000000"/>
@@ -897,7 +897,7 @@
         </w:tc>
         <w:tc>
           <w:tcPr>
-            <w:tcW w:w="4700" w:type="dxa"/>
+            <w:tcW w:w="3600" w:type="dxa"/>
             <w:tcBorders>
               <w:top w:val="single" w:sz="4" w:space="0" w:color="000000"/>
               <w:start w:val="single" w:sz="4" w:space="0" w:color="000000"/>
@@ -923,34 +923,33 @@
         </w:tc>
         <w:tc>
           <w:tcPr>
-            <w:tcW w:w="2400" w:type="dxa"/>
-            <w:tcBorders>
-              <w:top w:val="single" w:sz="4" w:space="0" w:color="000000"/>
-              <w:start w:val="single" w:sz="4" w:space="0" w:color="000000"/>
-              <w:bottom w:val="single" w:sz="4" w:space="0" w:color="000000"/>
-              <w:end w:val="single" w:sz="4" w:space="0" w:color="000000"/>
-            </w:tcBorders>
-          </w:tcPr>
-          <w:p>
-            <w:pPr>
-              <w:pStyle w:val="Normal"/>
-              <w:spacing w:lineRule="auto" w:line="240" w:before="0" w:after="0"/>
-              <w:jc w:val="start"/>
-            </w:pPr>
-            <w:r>
-              <w:rPr>
-                <w:rFonts w:ascii="Times New Roman" w:hAnsi="Times New Roman" w:cs="Times New Roman"/>
-                <w:sz w:val="20"/>
-                <w:szCs w:val="20"/>
-                <w:highlight w:val="yellow"/>
-              </w:rPr>
-              <w:t xml:space="preserve">_______________________</w:t>
-            </w:r>
-          </w:p>
-        </w:tc>
-        <w:tc>
-          <w:tcPr>
-            <w:tcW w:w="2500" w:type="dxa"/>
+            <w:tcW w:w="4300" w:type="dxa"/>
+            <w:tcBorders>
+              <w:top w:val="single" w:sz="4" w:space="0" w:color="000000"/>
+              <w:start w:val="single" w:sz="4" w:space="0" w:color="000000"/>
+              <w:bottom w:val="single" w:sz="4" w:space="0" w:color="000000"/>
+              <w:end w:val="single" w:sz="4" w:space="0" w:color="000000"/>
+            </w:tcBorders>
+          </w:tcPr>
+          <w:p>
+            <w:pPr>
+              <w:pStyle w:val="Normal"/>
+              <w:spacing w:lineRule="auto" w:line="240" w:before="0" w:after="0"/>
+              <w:jc w:val="start"/>
+            </w:pPr>
+            <w:r>
+              <w:rPr>
+                <w:rFonts w:ascii="Times New Roman" w:hAnsi="Times New Roman" w:cs="Times New Roman"/>
+                <w:sz w:val="20"/>
+                <w:szCs w:val="20"/>
+              </w:rPr>
+              <w:t xml:space="preserve">Интерактивное наглядное пособие (Слова и Азбука)</w:t>
+            </w:r>
+          </w:p>
+        </w:tc>
+        <w:tc>
+          <w:tcPr>
+            <w:tcW w:w="2300" w:type="dxa"/>
             <w:tcBorders>
               <w:top w:val="single" w:sz="4" w:space="0" w:color="000000"/>
               <w:start w:val="single" w:sz="4" w:space="0" w:color="000000"/>
@@ -1004,7 +1003,7 @@
         </w:tc>
         <w:tc>
           <w:tcPr>
-            <w:tcW w:w="4700" w:type="dxa"/>
+            <w:tcW w:w="3600" w:type="dxa"/>
             <w:tcBorders>
               <w:top w:val="single" w:sz="4" w:space="0" w:color="000000"/>
               <w:start w:val="single" w:sz="4" w:space="0" w:color="000000"/>
@@ -1030,34 +1029,33 @@
         </w:tc>
         <w:tc>
           <w:tcPr>
-            <w:tcW w:w="2400" w:type="dxa"/>
-            <w:tcBorders>
-              <w:top w:val="single" w:sz="4" w:space="0" w:color="000000"/>
-              <w:start w:val="single" w:sz="4" w:space="0" w:color="000000"/>
-              <w:bottom w:val="single" w:sz="4" w:space="0" w:color="000000"/>
-              <w:end w:val="single" w:sz="4" w:space="0" w:color="000000"/>
-            </w:tcBorders>
-          </w:tcPr>
-          <w:p>
-            <w:pPr>
-              <w:pStyle w:val="Normal"/>
-              <w:spacing w:lineRule="auto" w:line="240" w:before="0" w:after="0"/>
-              <w:jc w:val="start"/>
-            </w:pPr>
-            <w:r>
-              <w:rPr>
-                <w:rFonts w:ascii="Times New Roman" w:hAnsi="Times New Roman" w:cs="Times New Roman"/>
-                <w:sz w:val="20"/>
-                <w:szCs w:val="20"/>
-                <w:highlight w:val="yellow"/>
-              </w:rPr>
-              <w:t xml:space="preserve">_______________________</w:t>
-            </w:r>
-          </w:p>
-        </w:tc>
-        <w:tc>
-          <w:tcPr>
-            <w:tcW w:w="2500" w:type="dxa"/>
+            <w:tcW w:w="4300" w:type="dxa"/>
+            <w:tcBorders>
+              <w:top w:val="single" w:sz="4" w:space="0" w:color="000000"/>
+              <w:start w:val="single" w:sz="4" w:space="0" w:color="000000"/>
+              <w:bottom w:val="single" w:sz="4" w:space="0" w:color="000000"/>
+              <w:end w:val="single" w:sz="4" w:space="0" w:color="000000"/>
+            </w:tcBorders>
+          </w:tcPr>
+          <w:p>
+            <w:pPr>
+              <w:pStyle w:val="Normal"/>
+              <w:spacing w:lineRule="auto" w:line="240" w:before="0" w:after="0"/>
+              <w:jc w:val="start"/>
+            </w:pPr>
+            <w:r>
+              <w:rPr>
+                <w:rFonts w:ascii="Times New Roman" w:hAnsi="Times New Roman" w:cs="Times New Roman"/>
+                <w:sz w:val="20"/>
+                <w:szCs w:val="20"/>
+              </w:rPr>
+              <w:t xml:space="preserve">Интерактивное наглядное пособие (Русская словесность)</w:t>
+            </w:r>
+          </w:p>
+        </w:tc>
+        <w:tc>
+          <w:tcPr>
+            <w:tcW w:w="2300" w:type="dxa"/>
             <w:tcBorders>
               <w:top w:val="single" w:sz="4" w:space="0" w:color="000000"/>
               <w:start w:val="single" w:sz="4" w:space="0" w:color="000000"/>
@@ -1111,7 +1109,7 @@
         </w:tc>
         <w:tc>
           <w:tcPr>
-            <w:tcW w:w="4700" w:type="dxa"/>
+            <w:tcW w:w="3600" w:type="dxa"/>
             <w:tcBorders>
               <w:top w:val="single" w:sz="4" w:space="0" w:color="000000"/>
               <w:start w:val="single" w:sz="4" w:space="0" w:color="000000"/>
@@ -1137,34 +1135,33 @@
         </w:tc>
         <w:tc>
           <w:tcPr>
-            <w:tcW w:w="2400" w:type="dxa"/>
-            <w:tcBorders>
-              <w:top w:val="single" w:sz="4" w:space="0" w:color="000000"/>
-              <w:start w:val="single" w:sz="4" w:space="0" w:color="000000"/>
-              <w:bottom w:val="single" w:sz="4" w:space="0" w:color="000000"/>
-              <w:end w:val="single" w:sz="4" w:space="0" w:color="000000"/>
-            </w:tcBorders>
-          </w:tcPr>
-          <w:p>
-            <w:pPr>
-              <w:pStyle w:val="Normal"/>
-              <w:spacing w:lineRule="auto" w:line="240" w:before="0" w:after="0"/>
-              <w:jc w:val="start"/>
-            </w:pPr>
-            <w:r>
-              <w:rPr>
-                <w:rFonts w:ascii="Times New Roman" w:hAnsi="Times New Roman" w:cs="Times New Roman"/>
-                <w:sz w:val="20"/>
-                <w:szCs w:val="20"/>
-                <w:highlight w:val="yellow"/>
-              </w:rPr>
-              <w:t xml:space="preserve">_______________________</w:t>
-            </w:r>
-          </w:p>
-        </w:tc>
-        <w:tc>
-          <w:tcPr>
-            <w:tcW w:w="2500" w:type="dxa"/>
+            <w:tcW w:w="4300" w:type="dxa"/>
+            <w:tcBorders>
+              <w:top w:val="single" w:sz="4" w:space="0" w:color="000000"/>
+              <w:start w:val="single" w:sz="4" w:space="0" w:color="000000"/>
+              <w:bottom w:val="single" w:sz="4" w:space="0" w:color="000000"/>
+              <w:end w:val="single" w:sz="4" w:space="0" w:color="000000"/>
+            </w:tcBorders>
+          </w:tcPr>
+          <w:p>
+            <w:pPr>
+              <w:pStyle w:val="Normal"/>
+              <w:spacing w:lineRule="auto" w:line="240" w:before="0" w:after="0"/>
+              <w:jc w:val="start"/>
+            </w:pPr>
+            <w:r>
+              <w:rPr>
+                <w:rFonts w:ascii="Times New Roman" w:hAnsi="Times New Roman" w:cs="Times New Roman"/>
+                <w:sz w:val="20"/>
+                <w:szCs w:val="20"/>
+              </w:rPr>
+              <w:t xml:space="preserve">Интерактивное наглядное пособие (Иностранные слова)</w:t>
+            </w:r>
+          </w:p>
+        </w:tc>
+        <w:tc>
+          <w:tcPr>
+            <w:tcW w:w="2300" w:type="dxa"/>
             <w:tcBorders>
               <w:top w:val="single" w:sz="4" w:space="0" w:color="000000"/>
               <w:start w:val="single" w:sz="4" w:space="0" w:color="000000"/>
@@ -1218,7 +1215,7 @@
         </w:tc>
         <w:tc>
           <w:tcPr>
-            <w:tcW w:w="4700" w:type="dxa"/>
+            <w:tcW w:w="3600" w:type="dxa"/>
             <w:tcBorders>
               <w:top w:val="single" w:sz="4" w:space="0" w:color="000000"/>
               <w:start w:val="single" w:sz="4" w:space="0" w:color="000000"/>
@@ -1244,34 +1241,33 @@
         </w:tc>
         <w:tc>
           <w:tcPr>
-            <w:tcW w:w="2400" w:type="dxa"/>
-            <w:tcBorders>
-              <w:top w:val="single" w:sz="4" w:space="0" w:color="000000"/>
-              <w:start w:val="single" w:sz="4" w:space="0" w:color="000000"/>
-              <w:bottom w:val="single" w:sz="4" w:space="0" w:color="000000"/>
-              <w:end w:val="single" w:sz="4" w:space="0" w:color="000000"/>
-            </w:tcBorders>
-          </w:tcPr>
-          <w:p>
-            <w:pPr>
-              <w:pStyle w:val="Normal"/>
-              <w:spacing w:lineRule="auto" w:line="240" w:before="0" w:after="0"/>
-              <w:jc w:val="start"/>
-            </w:pPr>
-            <w:r>
-              <w:rPr>
-                <w:rFonts w:ascii="Times New Roman" w:hAnsi="Times New Roman" w:cs="Times New Roman"/>
-                <w:sz w:val="20"/>
-                <w:szCs w:val="20"/>
-                <w:highlight w:val="yellow"/>
-              </w:rPr>
-              <w:t xml:space="preserve">_______________________</w:t>
-            </w:r>
-          </w:p>
-        </w:tc>
-        <w:tc>
-          <w:tcPr>
-            <w:tcW w:w="2500" w:type="dxa"/>
+            <w:tcW w:w="4300" w:type="dxa"/>
+            <w:tcBorders>
+              <w:top w:val="single" w:sz="4" w:space="0" w:color="000000"/>
+              <w:start w:val="single" w:sz="4" w:space="0" w:color="000000"/>
+              <w:bottom w:val="single" w:sz="4" w:space="0" w:color="000000"/>
+              <w:end w:val="single" w:sz="4" w:space="0" w:color="000000"/>
+            </w:tcBorders>
+          </w:tcPr>
+          <w:p>
+            <w:pPr>
+              <w:pStyle w:val="Normal"/>
+              <w:spacing w:lineRule="auto" w:line="240" w:before="0" w:after="0"/>
+              <w:jc w:val="start"/>
+            </w:pPr>
+            <w:r>
+              <w:rPr>
+                <w:rFonts w:ascii="Times New Roman" w:hAnsi="Times New Roman" w:cs="Times New Roman"/>
+                <w:sz w:val="20"/>
+                <w:szCs w:val="20"/>
+              </w:rPr>
+              <w:t xml:space="preserve">Интерактивное наглядное пособие (Предмет «Математика»)</w:t>
+            </w:r>
+          </w:p>
+        </w:tc>
+        <w:tc>
+          <w:tcPr>
+            <w:tcW w:w="2300" w:type="dxa"/>
             <w:tcBorders>
               <w:top w:val="single" w:sz="4" w:space="0" w:color="000000"/>
               <w:start w:val="single" w:sz="4" w:space="0" w:color="000000"/>
@@ -1325,7 +1321,7 @@
         </w:tc>
         <w:tc>
           <w:tcPr>
-            <w:tcW w:w="4700" w:type="dxa"/>
+            <w:tcW w:w="3600" w:type="dxa"/>
             <w:tcBorders>
               <w:top w:val="single" w:sz="4" w:space="0" w:color="000000"/>
               <w:start w:val="single" w:sz="4" w:space="0" w:color="000000"/>
@@ -1351,34 +1347,33 @@
         </w:tc>
         <w:tc>
           <w:tcPr>
-            <w:tcW w:w="2400" w:type="dxa"/>
-            <w:tcBorders>
-              <w:top w:val="single" w:sz="4" w:space="0" w:color="000000"/>
-              <w:start w:val="single" w:sz="4" w:space="0" w:color="000000"/>
-              <w:bottom w:val="single" w:sz="4" w:space="0" w:color="000000"/>
-              <w:end w:val="single" w:sz="4" w:space="0" w:color="000000"/>
-            </w:tcBorders>
-          </w:tcPr>
-          <w:p>
-            <w:pPr>
-              <w:pStyle w:val="Normal"/>
-              <w:spacing w:lineRule="auto" w:line="240" w:before="0" w:after="0"/>
-              <w:jc w:val="start"/>
-            </w:pPr>
-            <w:r>
-              <w:rPr>
-                <w:rFonts w:ascii="Times New Roman" w:hAnsi="Times New Roman" w:cs="Times New Roman"/>
-                <w:sz w:val="20"/>
-                <w:szCs w:val="20"/>
-                <w:highlight w:val="yellow"/>
-              </w:rPr>
-              <w:t xml:space="preserve">_______________________</w:t>
-            </w:r>
-          </w:p>
-        </w:tc>
-        <w:tc>
-          <w:tcPr>
-            <w:tcW w:w="2500" w:type="dxa"/>
+            <w:tcW w:w="4300" w:type="dxa"/>
+            <w:tcBorders>
+              <w:top w:val="single" w:sz="4" w:space="0" w:color="000000"/>
+              <w:start w:val="single" w:sz="4" w:space="0" w:color="000000"/>
+              <w:bottom w:val="single" w:sz="4" w:space="0" w:color="000000"/>
+              <w:end w:val="single" w:sz="4" w:space="0" w:color="000000"/>
+            </w:tcBorders>
+          </w:tcPr>
+          <w:p>
+            <w:pPr>
+              <w:pStyle w:val="Normal"/>
+              <w:spacing w:lineRule="auto" w:line="240" w:before="0" w:after="0"/>
+              <w:jc w:val="start"/>
+            </w:pPr>
+            <w:r>
+              <w:rPr>
+                <w:rFonts w:ascii="Times New Roman" w:hAnsi="Times New Roman" w:cs="Times New Roman"/>
+                <w:sz w:val="20"/>
+                <w:szCs w:val="20"/>
+              </w:rPr>
+              <w:t xml:space="preserve">Интерактивное наглядное пособие (Предмет: «Химия»)</w:t>
+            </w:r>
+          </w:p>
+        </w:tc>
+        <w:tc>
+          <w:tcPr>
+            <w:tcW w:w="2300" w:type="dxa"/>
             <w:tcBorders>
               <w:top w:val="single" w:sz="4" w:space="0" w:color="000000"/>
               <w:start w:val="single" w:sz="4" w:space="0" w:color="000000"/>
@@ -1432,7 +1427,7 @@
         </w:tc>
         <w:tc>
           <w:tcPr>
-            <w:tcW w:w="4700" w:type="dxa"/>
+            <w:tcW w:w="3600" w:type="dxa"/>
             <w:tcBorders>
               <w:top w:val="single" w:sz="4" w:space="0" w:color="000000"/>
               <w:start w:val="single" w:sz="4" w:space="0" w:color="000000"/>
@@ -1458,34 +1453,33 @@
         </w:tc>
         <w:tc>
           <w:tcPr>
-            <w:tcW w:w="2400" w:type="dxa"/>
-            <w:tcBorders>
-              <w:top w:val="single" w:sz="4" w:space="0" w:color="000000"/>
-              <w:start w:val="single" w:sz="4" w:space="0" w:color="000000"/>
-              <w:bottom w:val="single" w:sz="4" w:space="0" w:color="000000"/>
-              <w:end w:val="single" w:sz="4" w:space="0" w:color="000000"/>
-            </w:tcBorders>
-          </w:tcPr>
-          <w:p>
-            <w:pPr>
-              <w:pStyle w:val="Normal"/>
-              <w:spacing w:lineRule="auto" w:line="240" w:before="0" w:after="0"/>
-              <w:jc w:val="start"/>
-            </w:pPr>
-            <w:r>
-              <w:rPr>
-                <w:rFonts w:ascii="Times New Roman" w:hAnsi="Times New Roman" w:cs="Times New Roman"/>
-                <w:sz w:val="20"/>
-                <w:szCs w:val="20"/>
-                <w:highlight w:val="yellow"/>
-              </w:rPr>
-              <w:t xml:space="preserve">_______________________</w:t>
-            </w:r>
-          </w:p>
-        </w:tc>
-        <w:tc>
-          <w:tcPr>
-            <w:tcW w:w="2500" w:type="dxa"/>
+            <w:tcW w:w="4300" w:type="dxa"/>
+            <w:tcBorders>
+              <w:top w:val="single" w:sz="4" w:space="0" w:color="000000"/>
+              <w:start w:val="single" w:sz="4" w:space="0" w:color="000000"/>
+              <w:bottom w:val="single" w:sz="4" w:space="0" w:color="000000"/>
+              <w:end w:val="single" w:sz="4" w:space="0" w:color="000000"/>
+            </w:tcBorders>
+          </w:tcPr>
+          <w:p>
+            <w:pPr>
+              <w:pStyle w:val="Normal"/>
+              <w:spacing w:lineRule="auto" w:line="240" w:before="0" w:after="0"/>
+              <w:jc w:val="start"/>
+            </w:pPr>
+            <w:r>
+              <w:rPr>
+                <w:rFonts w:ascii="Times New Roman" w:hAnsi="Times New Roman" w:cs="Times New Roman"/>
+                <w:sz w:val="20"/>
+                <w:szCs w:val="20"/>
+              </w:rPr>
+              <w:t xml:space="preserve">Интерактивное наглядное пособие (Предмет «Русский язык»)</w:t>
+            </w:r>
+          </w:p>
+        </w:tc>
+        <w:tc>
+          <w:tcPr>
+            <w:tcW w:w="2300" w:type="dxa"/>
             <w:tcBorders>
               <w:top w:val="single" w:sz="4" w:space="0" w:color="000000"/>
               <w:start w:val="single" w:sz="4" w:space="0" w:color="000000"/>
@@ -1539,7 +1533,7 @@
         </w:tc>
         <w:tc>
           <w:tcPr>
-            <w:tcW w:w="4700" w:type="dxa"/>
+            <w:tcW w:w="3600" w:type="dxa"/>
             <w:tcBorders>
               <w:top w:val="single" w:sz="4" w:space="0" w:color="000000"/>
               <w:start w:val="single" w:sz="4" w:space="0" w:color="000000"/>
@@ -1565,34 +1559,33 @@
         </w:tc>
         <w:tc>
           <w:tcPr>
-            <w:tcW w:w="2400" w:type="dxa"/>
-            <w:tcBorders>
-              <w:top w:val="single" w:sz="4" w:space="0" w:color="000000"/>
-              <w:start w:val="single" w:sz="4" w:space="0" w:color="000000"/>
-              <w:bottom w:val="single" w:sz="4" w:space="0" w:color="000000"/>
-              <w:end w:val="single" w:sz="4" w:space="0" w:color="000000"/>
-            </w:tcBorders>
-          </w:tcPr>
-          <w:p>
-            <w:pPr>
-              <w:pStyle w:val="Normal"/>
-              <w:spacing w:lineRule="auto" w:line="240" w:before="0" w:after="0"/>
-              <w:jc w:val="start"/>
-            </w:pPr>
-            <w:r>
-              <w:rPr>
-                <w:rFonts w:ascii="Times New Roman" w:hAnsi="Times New Roman" w:cs="Times New Roman"/>
-                <w:sz w:val="20"/>
-                <w:szCs w:val="20"/>
-                <w:highlight w:val="yellow"/>
-              </w:rPr>
-              <w:t xml:space="preserve">_______________________</w:t>
-            </w:r>
-          </w:p>
-        </w:tc>
-        <w:tc>
-          <w:tcPr>
-            <w:tcW w:w="2500" w:type="dxa"/>
+            <w:tcW w:w="4300" w:type="dxa"/>
+            <w:tcBorders>
+              <w:top w:val="single" w:sz="4" w:space="0" w:color="000000"/>
+              <w:start w:val="single" w:sz="4" w:space="0" w:color="000000"/>
+              <w:bottom w:val="single" w:sz="4" w:space="0" w:color="000000"/>
+              <w:end w:val="single" w:sz="4" w:space="0" w:color="000000"/>
+            </w:tcBorders>
+          </w:tcPr>
+          <w:p>
+            <w:pPr>
+              <w:pStyle w:val="Normal"/>
+              <w:spacing w:lineRule="auto" w:line="240" w:before="0" w:after="0"/>
+              <w:jc w:val="start"/>
+            </w:pPr>
+            <w:r>
+              <w:rPr>
+                <w:rFonts w:ascii="Times New Roman" w:hAnsi="Times New Roman" w:cs="Times New Roman"/>
+                <w:sz w:val="20"/>
+                <w:szCs w:val="20"/>
+              </w:rPr>
+              <w:t xml:space="preserve">Интерактивная таблица Менделеева Д.И.</w:t>
+            </w:r>
+          </w:p>
+        </w:tc>
+        <w:tc>
+          <w:tcPr>
+            <w:tcW w:w="2300" w:type="dxa"/>
             <w:tcBorders>
               <w:top w:val="single" w:sz="4" w:space="0" w:color="000000"/>
               <w:start w:val="single" w:sz="4" w:space="0" w:color="000000"/>
@@ -1646,7 +1639,7 @@
         </w:tc>
         <w:tc>
           <w:tcPr>
-            <w:tcW w:w="4700" w:type="dxa"/>
+            <w:tcW w:w="3600" w:type="dxa"/>
             <w:tcBorders>
               <w:top w:val="single" w:sz="4" w:space="0" w:color="000000"/>
               <w:start w:val="single" w:sz="4" w:space="0" w:color="000000"/>
@@ -1672,34 +1665,33 @@
         </w:tc>
         <w:tc>
           <w:tcPr>
-            <w:tcW w:w="2400" w:type="dxa"/>
-            <w:tcBorders>
-              <w:top w:val="single" w:sz="4" w:space="0" w:color="000000"/>
-              <w:start w:val="single" w:sz="4" w:space="0" w:color="000000"/>
-              <w:bottom w:val="single" w:sz="4" w:space="0" w:color="000000"/>
-              <w:end w:val="single" w:sz="4" w:space="0" w:color="000000"/>
-            </w:tcBorders>
-          </w:tcPr>
-          <w:p>
-            <w:pPr>
-              <w:pStyle w:val="Normal"/>
-              <w:spacing w:lineRule="auto" w:line="240" w:before="0" w:after="0"/>
-              <w:jc w:val="start"/>
-            </w:pPr>
-            <w:r>
-              <w:rPr>
-                <w:rFonts w:ascii="Times New Roman" w:hAnsi="Times New Roman" w:cs="Times New Roman"/>
-                <w:sz w:val="20"/>
-                <w:szCs w:val="20"/>
-                <w:highlight w:val="yellow"/>
-              </w:rPr>
-              <w:t xml:space="preserve">_______________________</w:t>
-            </w:r>
-          </w:p>
-        </w:tc>
-        <w:tc>
-          <w:tcPr>
-            <w:tcW w:w="2500" w:type="dxa"/>
+            <w:tcW w:w="4300" w:type="dxa"/>
+            <w:tcBorders>
+              <w:top w:val="single" w:sz="4" w:space="0" w:color="000000"/>
+              <w:start w:val="single" w:sz="4" w:space="0" w:color="000000"/>
+              <w:bottom w:val="single" w:sz="4" w:space="0" w:color="000000"/>
+              <w:end w:val="single" w:sz="4" w:space="0" w:color="000000"/>
+            </w:tcBorders>
+          </w:tcPr>
+          <w:p>
+            <w:pPr>
+              <w:pStyle w:val="Normal"/>
+              <w:spacing w:lineRule="auto" w:line="240" w:before="0" w:after="0"/>
+              <w:jc w:val="start"/>
+            </w:pPr>
+            <w:r>
+              <w:rPr>
+                <w:rFonts w:ascii="Times New Roman" w:hAnsi="Times New Roman" w:cs="Times New Roman"/>
+                <w:sz w:val="20"/>
+                <w:szCs w:val="20"/>
+              </w:rPr>
+              <w:t xml:space="preserve">Интерактивное наглядное пособие (Конструктор природных сообществ)</w:t>
+            </w:r>
+          </w:p>
+        </w:tc>
+        <w:tc>
+          <w:tcPr>
+            <w:tcW w:w="2300" w:type="dxa"/>
             <w:tcBorders>
               <w:top w:val="single" w:sz="4" w:space="0" w:color="000000"/>
               <w:start w:val="single" w:sz="4" w:space="0" w:color="000000"/>
@@ -1753,7 +1745,7 @@
         </w:tc>
         <w:tc>
           <w:tcPr>
-            <w:tcW w:w="4700" w:type="dxa"/>
+            <w:tcW w:w="3600" w:type="dxa"/>
             <w:tcBorders>
               <w:top w:val="single" w:sz="4" w:space="0" w:color="000000"/>
               <w:start w:val="single" w:sz="4" w:space="0" w:color="000000"/>
@@ -1779,34 +1771,33 @@
         </w:tc>
         <w:tc>
           <w:tcPr>
-            <w:tcW w:w="2400" w:type="dxa"/>
-            <w:tcBorders>
-              <w:top w:val="single" w:sz="4" w:space="0" w:color="000000"/>
-              <w:start w:val="single" w:sz="4" w:space="0" w:color="000000"/>
-              <w:bottom w:val="single" w:sz="4" w:space="0" w:color="000000"/>
-              <w:end w:val="single" w:sz="4" w:space="0" w:color="000000"/>
-            </w:tcBorders>
-          </w:tcPr>
-          <w:p>
-            <w:pPr>
-              <w:pStyle w:val="Normal"/>
-              <w:spacing w:lineRule="auto" w:line="240" w:before="0" w:after="0"/>
-              <w:jc w:val="start"/>
-            </w:pPr>
-            <w:r>
-              <w:rPr>
-                <w:rFonts w:ascii="Times New Roman" w:hAnsi="Times New Roman" w:cs="Times New Roman"/>
-                <w:sz w:val="20"/>
-                <w:szCs w:val="20"/>
-                <w:highlight w:val="yellow"/>
-              </w:rPr>
-              <w:t xml:space="preserve">_______________________</w:t>
-            </w:r>
-          </w:p>
-        </w:tc>
-        <w:tc>
-          <w:tcPr>
-            <w:tcW w:w="2500" w:type="dxa"/>
+            <w:tcW w:w="4300" w:type="dxa"/>
+            <w:tcBorders>
+              <w:top w:val="single" w:sz="4" w:space="0" w:color="000000"/>
+              <w:start w:val="single" w:sz="4" w:space="0" w:color="000000"/>
+              <w:bottom w:val="single" w:sz="4" w:space="0" w:color="000000"/>
+              <w:end w:val="single" w:sz="4" w:space="0" w:color="000000"/>
+            </w:tcBorders>
+          </w:tcPr>
+          <w:p>
+            <w:pPr>
+              <w:pStyle w:val="Normal"/>
+              <w:spacing w:lineRule="auto" w:line="240" w:before="0" w:after="0"/>
+              <w:jc w:val="start"/>
+            </w:pPr>
+            <w:r>
+              <w:rPr>
+                <w:rFonts w:ascii="Times New Roman" w:hAnsi="Times New Roman" w:cs="Times New Roman"/>
+                <w:sz w:val="20"/>
+                <w:szCs w:val="20"/>
+              </w:rPr>
+              <w:t xml:space="preserve">Интерактивное наглядное пособие (Временные линии)</w:t>
+            </w:r>
+          </w:p>
+        </w:tc>
+        <w:tc>
+          <w:tcPr>
+            <w:tcW w:w="2300" w:type="dxa"/>
             <w:tcBorders>
               <w:top w:val="single" w:sz="4" w:space="0" w:color="000000"/>
               <w:start w:val="single" w:sz="4" w:space="0" w:color="000000"/>
@@ -2541,7 +2532,7 @@
           <w:sz w:val="24"/>
           <w:szCs w:val="24"/>
         </w:rPr>
-        <w:t xml:space="preserve">Период разработки подтверждается датированными артефактами репозитория: наиболее ранний — миграция базы данных от 10 января 2026 года, наиболее поздний — изменение от 18 сентября 2026 года. Календарная продолжительность составляет около 8,3 месяца.</w:t>
+        <w:t xml:space="preserve">Документально подтверждённый учёт рабочего времени по проекту не предоставлен, поэтому трудозатраты определены нормативным методом — по объёму фактически созданного исходного текста и типовым нормам выработки, принятым для промышленной разработки прикладного программного обеспечения на языках высокого уровня.</w:t>
       </w:r>
     </w:p>
     <w:p>
@@ -2556,24 +2547,470 @@
           <w:sz w:val="24"/>
           <w:szCs w:val="24"/>
         </w:rPr>
-        <w:t xml:space="preserve">Численность персонала, занятого в разработке, — 2 специалиста. Произведение календарной продолжительности на численность даёт верхнюю арифметическую границу трудозатрат: около 17 человеко-месяцев.</w:t>
+        <w:t xml:space="preserve">Норма выработки отражает полный цикл работ по созданию единицы кода: проектирование, кодирование, отладку, тестирование, устранение дефектов и документирование, — а не только набор текста программы. Для прикладного кода принят диапазон 1 500–2 500 строк на человеко-месяц; для автоматических тестов, имеющих более однородную структуру и меньшую алгоритмическую сложность, — 3 000–4 000 строк на человеко-месяц.</w:t>
       </w:r>
     </w:p>
+    <w:tbl>
+      <w:tblPr>
+        <w:tblW w:w="10700" w:type="dxa"/>
+        <w:jc w:val="start"/>
+        <w:tblInd w:w="108" w:type="dxa"/>
+        <w:tblLayout w:type="fixed"/>
+        <w:tblCellMar>
+          <w:top w:w="0" w:type="dxa"/>
+          <w:start w:w="85" w:type="dxa"/>
+          <w:bottom w:w="0" w:type="dxa"/>
+          <w:end w:w="85" w:type="dxa"/>
+        </w:tblCellMar>
+      </w:tblPr>
+      <w:tblGrid>
+        <w:gridCol w:w="3800"/>
+        <w:gridCol w:w="2100"/>
+        <w:gridCol w:w="2300"/>
+        <w:gridCol w:w="2500"/>
+      </w:tblGrid>
+      <w:tr>
+        <w:trPr>
+          <w:tblHeader/>
+        </w:trPr>
+        <w:tc>
+          <w:tcPr>
+            <w:tcW w:w="3800" w:type="dxa"/>
+            <w:tcBorders>
+              <w:top w:val="single" w:sz="4" w:space="0" w:color="000000"/>
+              <w:start w:val="single" w:sz="4" w:space="0" w:color="000000"/>
+              <w:bottom w:val="single" w:sz="4" w:space="0" w:color="000000"/>
+              <w:end w:val="single" w:sz="4" w:space="0" w:color="000000"/>
+            </w:tcBorders>
+          </w:tcPr>
+          <w:p>
+            <w:pPr>
+              <w:pStyle w:val="Normal"/>
+              <w:spacing w:lineRule="auto" w:line="240" w:before="0" w:after="0"/>
+              <w:jc w:val="start"/>
+            </w:pPr>
+            <w:r>
+              <w:rPr>
+                <w:rFonts w:ascii="Times New Roman" w:hAnsi="Times New Roman" w:cs="Times New Roman"/>
+                <w:b/>
+                <w:bCs/>
+                <w:sz w:val="20"/>
+                <w:szCs w:val="20"/>
+              </w:rPr>
+              <w:t xml:space="preserve">Категория исходного текста</w:t>
+            </w:r>
+          </w:p>
+        </w:tc>
+        <w:tc>
+          <w:tcPr>
+            <w:tcW w:w="2100" w:type="dxa"/>
+            <w:tcBorders>
+              <w:top w:val="single" w:sz="4" w:space="0" w:color="000000"/>
+              <w:start w:val="single" w:sz="4" w:space="0" w:color="000000"/>
+              <w:bottom w:val="single" w:sz="4" w:space="0" w:color="000000"/>
+              <w:end w:val="single" w:sz="4" w:space="0" w:color="000000"/>
+            </w:tcBorders>
+          </w:tcPr>
+          <w:p>
+            <w:pPr>
+              <w:pStyle w:val="Normal"/>
+              <w:spacing w:lineRule="auto" w:line="240" w:before="0" w:after="0"/>
+              <w:jc w:val="start"/>
+            </w:pPr>
+            <w:r>
+              <w:rPr>
+                <w:rFonts w:ascii="Times New Roman" w:hAnsi="Times New Roman" w:cs="Times New Roman"/>
+                <w:b/>
+                <w:bCs/>
+                <w:sz w:val="20"/>
+                <w:szCs w:val="20"/>
+              </w:rPr>
+              <w:t xml:space="preserve">Объём, строк</w:t>
+            </w:r>
+          </w:p>
+        </w:tc>
+        <w:tc>
+          <w:tcPr>
+            <w:tcW w:w="2300" w:type="dxa"/>
+            <w:tcBorders>
+              <w:top w:val="single" w:sz="4" w:space="0" w:color="000000"/>
+              <w:start w:val="single" w:sz="4" w:space="0" w:color="000000"/>
+              <w:bottom w:val="single" w:sz="4" w:space="0" w:color="000000"/>
+              <w:end w:val="single" w:sz="4" w:space="0" w:color="000000"/>
+            </w:tcBorders>
+          </w:tcPr>
+          <w:p>
+            <w:pPr>
+              <w:pStyle w:val="Normal"/>
+              <w:spacing w:lineRule="auto" w:line="240" w:before="0" w:after="0"/>
+              <w:jc w:val="start"/>
+            </w:pPr>
+            <w:r>
+              <w:rPr>
+                <w:rFonts w:ascii="Times New Roman" w:hAnsi="Times New Roman" w:cs="Times New Roman"/>
+                <w:b/>
+                <w:bCs/>
+                <w:sz w:val="20"/>
+                <w:szCs w:val="20"/>
+              </w:rPr>
+              <w:t xml:space="preserve">Норма выработки, строк / чел.-мес</w:t>
+            </w:r>
+          </w:p>
+        </w:tc>
+        <w:tc>
+          <w:tcPr>
+            <w:tcW w:w="2500" w:type="dxa"/>
+            <w:tcBorders>
+              <w:top w:val="single" w:sz="4" w:space="0" w:color="000000"/>
+              <w:start w:val="single" w:sz="4" w:space="0" w:color="000000"/>
+              <w:bottom w:val="single" w:sz="4" w:space="0" w:color="000000"/>
+              <w:end w:val="single" w:sz="4" w:space="0" w:color="000000"/>
+            </w:tcBorders>
+          </w:tcPr>
+          <w:p>
+            <w:pPr>
+              <w:pStyle w:val="Normal"/>
+              <w:spacing w:lineRule="auto" w:line="240" w:before="0" w:after="0"/>
+              <w:jc w:val="start"/>
+            </w:pPr>
+            <w:r>
+              <w:rPr>
+                <w:rFonts w:ascii="Times New Roman" w:hAnsi="Times New Roman" w:cs="Times New Roman"/>
+                <w:b/>
+                <w:bCs/>
+                <w:sz w:val="20"/>
+                <w:szCs w:val="20"/>
+              </w:rPr>
+              <w:t xml:space="preserve">Трудозатраты, чел.-мес</w:t>
+            </w:r>
+          </w:p>
+        </w:tc>
+      </w:tr>
+      <w:tr>
+        <w:tc>
+          <w:tcPr>
+            <w:tcW w:w="3800" w:type="dxa"/>
+            <w:tcBorders>
+              <w:top w:val="single" w:sz="4" w:space="0" w:color="000000"/>
+              <w:start w:val="single" w:sz="4" w:space="0" w:color="000000"/>
+              <w:bottom w:val="single" w:sz="4" w:space="0" w:color="000000"/>
+              <w:end w:val="single" w:sz="4" w:space="0" w:color="000000"/>
+            </w:tcBorders>
+          </w:tcPr>
+          <w:p>
+            <w:pPr>
+              <w:pStyle w:val="Normal"/>
+              <w:spacing w:lineRule="auto" w:line="240" w:before="0" w:after="0"/>
+              <w:jc w:val="start"/>
+            </w:pPr>
+            <w:r>
+              <w:rPr>
+                <w:rFonts w:ascii="Times New Roman" w:hAnsi="Times New Roman" w:cs="Times New Roman"/>
+                <w:sz w:val="20"/>
+                <w:szCs w:val="20"/>
+              </w:rPr>
+              <w:t xml:space="preserve">Прикладной код (без тестов)</w:t>
+            </w:r>
+          </w:p>
+        </w:tc>
+        <w:tc>
+          <w:tcPr>
+            <w:tcW w:w="2100" w:type="dxa"/>
+            <w:tcBorders>
+              <w:top w:val="single" w:sz="4" w:space="0" w:color="000000"/>
+              <w:start w:val="single" w:sz="4" w:space="0" w:color="000000"/>
+              <w:bottom w:val="single" w:sz="4" w:space="0" w:color="000000"/>
+              <w:end w:val="single" w:sz="4" w:space="0" w:color="000000"/>
+            </w:tcBorders>
+          </w:tcPr>
+          <w:p>
+            <w:pPr>
+              <w:pStyle w:val="Normal"/>
+              <w:spacing w:lineRule="auto" w:line="240" w:before="0" w:after="0"/>
+              <w:jc w:val="start"/>
+            </w:pPr>
+            <w:r>
+              <w:rPr>
+                <w:rFonts w:ascii="Times New Roman" w:hAnsi="Times New Roman" w:cs="Times New Roman"/>
+                <w:sz w:val="20"/>
+                <w:szCs w:val="20"/>
+              </w:rPr>
+              <w:t xml:space="preserve">136 562</w:t>
+            </w:r>
+          </w:p>
+        </w:tc>
+        <w:tc>
+          <w:tcPr>
+            <w:tcW w:w="2300" w:type="dxa"/>
+            <w:tcBorders>
+              <w:top w:val="single" w:sz="4" w:space="0" w:color="000000"/>
+              <w:start w:val="single" w:sz="4" w:space="0" w:color="000000"/>
+              <w:bottom w:val="single" w:sz="4" w:space="0" w:color="000000"/>
+              <w:end w:val="single" w:sz="4" w:space="0" w:color="000000"/>
+            </w:tcBorders>
+          </w:tcPr>
+          <w:p>
+            <w:pPr>
+              <w:pStyle w:val="Normal"/>
+              <w:spacing w:lineRule="auto" w:line="240" w:before="0" w:after="0"/>
+              <w:jc w:val="start"/>
+            </w:pPr>
+            <w:r>
+              <w:rPr>
+                <w:rFonts w:ascii="Times New Roman" w:hAnsi="Times New Roman" w:cs="Times New Roman"/>
+                <w:sz w:val="20"/>
+                <w:szCs w:val="20"/>
+              </w:rPr>
+              <w:t xml:space="preserve">1 500 – 2 500</w:t>
+            </w:r>
+          </w:p>
+        </w:tc>
+        <w:tc>
+          <w:tcPr>
+            <w:tcW w:w="2500" w:type="dxa"/>
+            <w:tcBorders>
+              <w:top w:val="single" w:sz="4" w:space="0" w:color="000000"/>
+              <w:start w:val="single" w:sz="4" w:space="0" w:color="000000"/>
+              <w:bottom w:val="single" w:sz="4" w:space="0" w:color="000000"/>
+              <w:end w:val="single" w:sz="4" w:space="0" w:color="000000"/>
+            </w:tcBorders>
+          </w:tcPr>
+          <w:p>
+            <w:pPr>
+              <w:pStyle w:val="Normal"/>
+              <w:spacing w:lineRule="auto" w:line="240" w:before="0" w:after="0"/>
+              <w:jc w:val="start"/>
+            </w:pPr>
+            <w:r>
+              <w:rPr>
+                <w:rFonts w:ascii="Times New Roman" w:hAnsi="Times New Roman" w:cs="Times New Roman"/>
+                <w:sz w:val="20"/>
+                <w:szCs w:val="20"/>
+              </w:rPr>
+              <w:t xml:space="preserve">54,6 – 91,0</w:t>
+            </w:r>
+          </w:p>
+        </w:tc>
+      </w:tr>
+      <w:tr>
+        <w:tc>
+          <w:tcPr>
+            <w:tcW w:w="3800" w:type="dxa"/>
+            <w:tcBorders>
+              <w:top w:val="single" w:sz="4" w:space="0" w:color="000000"/>
+              <w:start w:val="single" w:sz="4" w:space="0" w:color="000000"/>
+              <w:bottom w:val="single" w:sz="4" w:space="0" w:color="000000"/>
+              <w:end w:val="single" w:sz="4" w:space="0" w:color="000000"/>
+            </w:tcBorders>
+          </w:tcPr>
+          <w:p>
+            <w:pPr>
+              <w:pStyle w:val="Normal"/>
+              <w:spacing w:lineRule="auto" w:line="240" w:before="0" w:after="0"/>
+              <w:jc w:val="start"/>
+            </w:pPr>
+            <w:r>
+              <w:rPr>
+                <w:rFonts w:ascii="Times New Roman" w:hAnsi="Times New Roman" w:cs="Times New Roman"/>
+                <w:sz w:val="20"/>
+                <w:szCs w:val="20"/>
+              </w:rPr>
+              <w:t xml:space="preserve">Автоматические тесты</w:t>
+            </w:r>
+          </w:p>
+        </w:tc>
+        <w:tc>
+          <w:tcPr>
+            <w:tcW w:w="2100" w:type="dxa"/>
+            <w:tcBorders>
+              <w:top w:val="single" w:sz="4" w:space="0" w:color="000000"/>
+              <w:start w:val="single" w:sz="4" w:space="0" w:color="000000"/>
+              <w:bottom w:val="single" w:sz="4" w:space="0" w:color="000000"/>
+              <w:end w:val="single" w:sz="4" w:space="0" w:color="000000"/>
+            </w:tcBorders>
+          </w:tcPr>
+          <w:p>
+            <w:pPr>
+              <w:pStyle w:val="Normal"/>
+              <w:spacing w:lineRule="auto" w:line="240" w:before="0" w:after="0"/>
+              <w:jc w:val="start"/>
+            </w:pPr>
+            <w:r>
+              <w:rPr>
+                <w:rFonts w:ascii="Times New Roman" w:hAnsi="Times New Roman" w:cs="Times New Roman"/>
+                <w:sz w:val="20"/>
+                <w:szCs w:val="20"/>
+              </w:rPr>
+              <w:t xml:space="preserve">22 627</w:t>
+            </w:r>
+          </w:p>
+        </w:tc>
+        <w:tc>
+          <w:tcPr>
+            <w:tcW w:w="2300" w:type="dxa"/>
+            <w:tcBorders>
+              <w:top w:val="single" w:sz="4" w:space="0" w:color="000000"/>
+              <w:start w:val="single" w:sz="4" w:space="0" w:color="000000"/>
+              <w:bottom w:val="single" w:sz="4" w:space="0" w:color="000000"/>
+              <w:end w:val="single" w:sz="4" w:space="0" w:color="000000"/>
+            </w:tcBorders>
+          </w:tcPr>
+          <w:p>
+            <w:pPr>
+              <w:pStyle w:val="Normal"/>
+              <w:spacing w:lineRule="auto" w:line="240" w:before="0" w:after="0"/>
+              <w:jc w:val="start"/>
+            </w:pPr>
+            <w:r>
+              <w:rPr>
+                <w:rFonts w:ascii="Times New Roman" w:hAnsi="Times New Roman" w:cs="Times New Roman"/>
+                <w:sz w:val="20"/>
+                <w:szCs w:val="20"/>
+              </w:rPr>
+              <w:t xml:space="preserve">3 000 – 4 000</w:t>
+            </w:r>
+          </w:p>
+        </w:tc>
+        <w:tc>
+          <w:tcPr>
+            <w:tcW w:w="2500" w:type="dxa"/>
+            <w:tcBorders>
+              <w:top w:val="single" w:sz="4" w:space="0" w:color="000000"/>
+              <w:start w:val="single" w:sz="4" w:space="0" w:color="000000"/>
+              <w:bottom w:val="single" w:sz="4" w:space="0" w:color="000000"/>
+              <w:end w:val="single" w:sz="4" w:space="0" w:color="000000"/>
+            </w:tcBorders>
+          </w:tcPr>
+          <w:p>
+            <w:pPr>
+              <w:pStyle w:val="Normal"/>
+              <w:spacing w:lineRule="auto" w:line="240" w:before="0" w:after="0"/>
+              <w:jc w:val="start"/>
+            </w:pPr>
+            <w:r>
+              <w:rPr>
+                <w:rFonts w:ascii="Times New Roman" w:hAnsi="Times New Roman" w:cs="Times New Roman"/>
+                <w:sz w:val="20"/>
+                <w:szCs w:val="20"/>
+              </w:rPr>
+              <w:t xml:space="preserve">5,7 – 7,5</w:t>
+            </w:r>
+          </w:p>
+        </w:tc>
+      </w:tr>
+      <w:tr>
+        <w:tc>
+          <w:tcPr>
+            <w:tcW w:w="3800" w:type="dxa"/>
+            <w:tcBorders>
+              <w:top w:val="single" w:sz="4" w:space="0" w:color="000000"/>
+              <w:start w:val="single" w:sz="4" w:space="0" w:color="000000"/>
+              <w:bottom w:val="single" w:sz="4" w:space="0" w:color="000000"/>
+              <w:end w:val="single" w:sz="4" w:space="0" w:color="000000"/>
+            </w:tcBorders>
+          </w:tcPr>
+          <w:p>
+            <w:pPr>
+              <w:pStyle w:val="Normal"/>
+              <w:spacing w:lineRule="auto" w:line="240" w:before="0" w:after="0"/>
+              <w:jc w:val="start"/>
+            </w:pPr>
+            <w:r>
+              <w:rPr>
+                <w:rFonts w:ascii="Times New Roman" w:hAnsi="Times New Roman" w:cs="Times New Roman"/>
+                <w:sz w:val="20"/>
+                <w:szCs w:val="20"/>
+              </w:rPr>
+              <w:t xml:space="preserve">Итого</w:t>
+            </w:r>
+          </w:p>
+        </w:tc>
+        <w:tc>
+          <w:tcPr>
+            <w:tcW w:w="2100" w:type="dxa"/>
+            <w:tcBorders>
+              <w:top w:val="single" w:sz="4" w:space="0" w:color="000000"/>
+              <w:start w:val="single" w:sz="4" w:space="0" w:color="000000"/>
+              <w:bottom w:val="single" w:sz="4" w:space="0" w:color="000000"/>
+              <w:end w:val="single" w:sz="4" w:space="0" w:color="000000"/>
+            </w:tcBorders>
+          </w:tcPr>
+          <w:p>
+            <w:pPr>
+              <w:pStyle w:val="Normal"/>
+              <w:spacing w:lineRule="auto" w:line="240" w:before="0" w:after="0"/>
+              <w:jc w:val="start"/>
+            </w:pPr>
+            <w:r>
+              <w:rPr>
+                <w:rFonts w:ascii="Times New Roman" w:hAnsi="Times New Roman" w:cs="Times New Roman"/>
+                <w:sz w:val="20"/>
+                <w:szCs w:val="20"/>
+              </w:rPr>
+              <w:t xml:space="preserve">159 189</w:t>
+            </w:r>
+          </w:p>
+        </w:tc>
+        <w:tc>
+          <w:tcPr>
+            <w:tcW w:w="2300" w:type="dxa"/>
+            <w:tcBorders>
+              <w:top w:val="single" w:sz="4" w:space="0" w:color="000000"/>
+              <w:start w:val="single" w:sz="4" w:space="0" w:color="000000"/>
+              <w:bottom w:val="single" w:sz="4" w:space="0" w:color="000000"/>
+              <w:end w:val="single" w:sz="4" w:space="0" w:color="000000"/>
+            </w:tcBorders>
+          </w:tcPr>
+          <w:p>
+            <w:pPr>
+              <w:pStyle w:val="Normal"/>
+              <w:spacing w:lineRule="auto" w:line="240" w:before="0" w:after="0"/>
+              <w:jc w:val="start"/>
+            </w:pPr>
+            <w:r>
+              <w:rPr>
+                <w:rFonts w:ascii="Times New Roman" w:hAnsi="Times New Roman" w:cs="Times New Roman"/>
+                <w:sz w:val="20"/>
+                <w:szCs w:val="20"/>
+              </w:rPr>
+              <w:t xml:space="preserve">—</w:t>
+            </w:r>
+          </w:p>
+        </w:tc>
+        <w:tc>
+          <w:tcPr>
+            <w:tcW w:w="2500" w:type="dxa"/>
+            <w:tcBorders>
+              <w:top w:val="single" w:sz="4" w:space="0" w:color="000000"/>
+              <w:start w:val="single" w:sz="4" w:space="0" w:color="000000"/>
+              <w:bottom w:val="single" w:sz="4" w:space="0" w:color="000000"/>
+              <w:end w:val="single" w:sz="4" w:space="0" w:color="000000"/>
+            </w:tcBorders>
+          </w:tcPr>
+          <w:p>
+            <w:pPr>
+              <w:pStyle w:val="Normal"/>
+              <w:spacing w:lineRule="auto" w:line="240" w:before="0" w:after="0"/>
+              <w:jc w:val="start"/>
+            </w:pPr>
+            <w:r>
+              <w:rPr>
+                <w:rFonts w:ascii="Times New Roman" w:hAnsi="Times New Roman" w:cs="Times New Roman"/>
+                <w:sz w:val="20"/>
+                <w:szCs w:val="20"/>
+              </w:rPr>
+              <w:t xml:space="preserve">60,3 – 98,5</w:t>
+            </w:r>
+          </w:p>
+        </w:tc>
+      </w:tr>
+    </w:tbl>
     <w:p>
       <w:pPr>
         <w:pStyle w:val="Normal"/>
         <w:ind w:firstLine="708"/>
         <w:jc w:val="both"/>
       </w:pPr>
-      <w:r>
-        <w:rPr>
-          <w:rFonts w:ascii="Times New Roman" w:hAnsi="Times New Roman" w:cs="Times New Roman"/>
-          <w:sz w:val="24"/>
-          <w:szCs w:val="24"/>
-          <w:highlight w:val="yellow"/>
-        </w:rPr>
-        <w:t xml:space="preserve">Точная величина фактических трудозатрат подлежит подтверждению правообладателем: полная история системы контроля версий в предоставленном экземпляре репозитория недоступна, поэтому распределение работ по месяцам расчётом не восстанавливается.</w:t>
-      </w:r>
     </w:p>
     <w:p>
       <w:pPr>
@@ -2587,7 +3024,37 @@
           <w:sz w:val="24"/>
           <w:szCs w:val="24"/>
         </w:rPr>
-        <w:t xml:space="preserve">Отношение объёма исходного текста к трудозатратам составляет около 9 400 строк на человеко-месяц, что в 4–6 раз превышает типовую отраслевую производительность (1 500–2 500 строк на человеко-месяц). Это существенно для выбора базы в затратном подходе: фактические затраты правообладателя и стоимость воссоздания комплекса сторонней командой различаются кратно.</w:t>
+        <w:t xml:space="preserve">Расчётные трудозатраты на создание программного обеспечения составляют от 60 до 99 человеко-месяцев. В качестве центрального принимается значение 75 человеко-месяцев, соответствующее нормам 2 000 строк на человеко-месяц для прикладного кода и 3 500 строк на человеко-месяц для автоматических тестов.</w:t>
+      </w:r>
+    </w:p>
+    <w:p>
+      <w:pPr>
+        <w:pStyle w:val="Normal"/>
+        <w:ind w:firstLine="708"/>
+        <w:jc w:val="both"/>
+      </w:pPr>
+      <w:r>
+        <w:rPr>
+          <w:rFonts w:ascii="Times New Roman" w:hAnsi="Times New Roman" w:cs="Times New Roman"/>
+          <w:sz w:val="24"/>
+          <w:szCs w:val="24"/>
+        </w:rPr>
+        <w:t xml:space="preserve">Расчёт является консервативным: в него не включены работы, не выражающиеся в объёме исходного текста, — подготовка поставляемого учебного контента (138 958 строк описаний в формате JSON и 8 265 медиафайлов), разработка эксплуатационной и проектной документации (20 035 строк), а также приёмочные испытания. Их учёт увеличил бы расчётную величину трудозатрат.</w:t>
+      </w:r>
+    </w:p>
+    <w:p>
+      <w:pPr>
+        <w:pStyle w:val="Normal"/>
+        <w:ind w:firstLine="708"/>
+        <w:jc w:val="both"/>
+      </w:pPr>
+      <w:r>
+        <w:rPr>
+          <w:rFonts w:ascii="Times New Roman" w:hAnsi="Times New Roman" w:cs="Times New Roman"/>
+          <w:sz w:val="24"/>
+          <w:szCs w:val="24"/>
+        </w:rPr>
+        <w:t xml:space="preserve">Календарная продолжительность разработки подтверждается датированными артефактами репозитория: наиболее ранний — миграция базы данных от 10 января 2026 года, наиболее поздний — изменение от 18 сентября 2026 года. Календарная продолжительность работ мерой трудозатрат не является: она не отражает ни интенсивности работ, ни степени распараллеливания, ни применения средств автоматизации разработки, и в настоящем расчёте не используется.</w:t>
       </w:r>
     </w:p>
     <w:p>
@@ -4507,12 +4974,12 @@
           <w:sz w:val="24"/>
           <w:szCs w:val="24"/>
         </w:rPr>
-        <w:t xml:space="preserve">Вариант А — по фактическим затратам правообладателя. База: 17 человеко-месяцев (раздел 4). Ставка — полная стоимость специалиста для работодателя с учётом налогов и накладных расходов.</w:t>
+        <w:t xml:space="preserve">База расчёта — нормативные трудозатраты по разделу 4. Ставка принимается как полная стоимость специалиста для работодателя, включающая оплату труда, страховые взносы и накладные расходы. Ставки заказной разработки у подрядных организаций выше приведённых и в расчёте не применялись.</w:t>
       </w:r>
     </w:p>
     <w:tbl>
       <w:tblPr>
-        <w:tblW w:w="10200" w:type="dxa"/>
+        <w:tblW w:w="10600" w:type="dxa"/>
         <w:jc w:val="start"/>
         <w:tblInd w:w="108" w:type="dxa"/>
         <w:tblLayout w:type="fixed"/>
@@ -4524,9 +4991,10 @@
         </w:tblCellMar>
       </w:tblPr>
       <w:tblGrid>
-        <w:gridCol w:w="5200"/>
-        <w:gridCol w:w="2500"/>
-        <w:gridCol w:w="2500"/>
+        <w:gridCol w:w="2800"/>
+        <w:gridCol w:w="2600"/>
+        <w:gridCol w:w="2600"/>
+        <w:gridCol w:w="2600"/>
       </w:tblGrid>
       <w:tr>
         <w:trPr>
@@ -4534,7 +5002,7 @@
         </w:trPr>
         <w:tc>
           <w:tcPr>
-            <w:tcW w:w="5200" w:type="dxa"/>
+            <w:tcW w:w="2800" w:type="dxa"/>
             <w:tcBorders>
               <w:top w:val="single" w:sz="4" w:space="0" w:color="000000"/>
               <w:start w:val="single" w:sz="4" w:space="0" w:color="000000"/>
@@ -4556,13 +5024,13 @@
                 <w:sz w:val="20"/>
                 <w:szCs w:val="20"/>
               </w:rPr>
-              <w:t xml:space="preserve">Ставка, ₽ за человеко-месяц</w:t>
-            </w:r>
-          </w:p>
-        </w:tc>
-        <w:tc>
-          <w:tcPr>
-            <w:tcW w:w="2500" w:type="dxa"/>
+              <w:t xml:space="preserve">Трудозатраты</w:t>
+            </w:r>
+          </w:p>
+        </w:tc>
+        <w:tc>
+          <w:tcPr>
+            <w:tcW w:w="2600" w:type="dxa"/>
             <w:tcBorders>
               <w:top w:val="single" w:sz="4" w:space="0" w:color="000000"/>
               <w:start w:val="single" w:sz="4" w:space="0" w:color="000000"/>
@@ -4584,13 +5052,13 @@
                 <w:sz w:val="20"/>
                 <w:szCs w:val="20"/>
               </w:rPr>
-              <w:t xml:space="preserve">Трудозатраты</w:t>
-            </w:r>
-          </w:p>
-        </w:tc>
-        <w:tc>
-          <w:tcPr>
-            <w:tcW w:w="2500" w:type="dxa"/>
+              <w:t xml:space="preserve">Ставка 250 000 ₽</w:t>
+            </w:r>
+          </w:p>
+        </w:tc>
+        <w:tc>
+          <w:tcPr>
+            <w:tcW w:w="2600" w:type="dxa"/>
             <w:tcBorders>
               <w:top w:val="single" w:sz="4" w:space="0" w:color="000000"/>
               <w:start w:val="single" w:sz="4" w:space="0" w:color="000000"/>
@@ -4612,7 +5080,35 @@
                 <w:sz w:val="20"/>
                 <w:szCs w:val="20"/>
               </w:rPr>
-              <w:t xml:space="preserve">Стоимость, ₽</w:t>
+              <w:t xml:space="preserve">Ставка 350 000 ₽</w:t>
+            </w:r>
+          </w:p>
+        </w:tc>
+        <w:tc>
+          <w:tcPr>
+            <w:tcW w:w="2600" w:type="dxa"/>
+            <w:tcBorders>
+              <w:top w:val="single" w:sz="4" w:space="0" w:color="000000"/>
+              <w:start w:val="single" w:sz="4" w:space="0" w:color="000000"/>
+              <w:bottom w:val="single" w:sz="4" w:space="0" w:color="000000"/>
+              <w:end w:val="single" w:sz="4" w:space="0" w:color="000000"/>
+            </w:tcBorders>
+          </w:tcPr>
+          <w:p>
+            <w:pPr>
+              <w:pStyle w:val="Normal"/>
+              <w:spacing w:lineRule="auto" w:line="240" w:before="0" w:after="0"/>
+              <w:jc w:val="start"/>
+            </w:pPr>
+            <w:r>
+              <w:rPr>
+                <w:rFonts w:ascii="Times New Roman" w:hAnsi="Times New Roman" w:cs="Times New Roman"/>
+                <w:b/>
+                <w:bCs/>
+                <w:sz w:val="20"/>
+                <w:szCs w:val="20"/>
+              </w:rPr>
+              <w:t xml:space="preserve">Ставка 450 000 ₽</w:t>
             </w:r>
           </w:p>
         </w:tc>
@@ -4620,79 +5116,105 @@
       <w:tr>
         <w:tc>
           <w:tcPr>
-            <w:tcW w:w="5200" w:type="dxa"/>
-            <w:tcBorders>
-              <w:top w:val="single" w:sz="4" w:space="0" w:color="000000"/>
-              <w:start w:val="single" w:sz="4" w:space="0" w:color="000000"/>
-              <w:bottom w:val="single" w:sz="4" w:space="0" w:color="000000"/>
-              <w:end w:val="single" w:sz="4" w:space="0" w:color="000000"/>
-            </w:tcBorders>
-          </w:tcPr>
-          <w:p>
-            <w:pPr>
-              <w:pStyle w:val="Normal"/>
-              <w:spacing w:lineRule="auto" w:line="240" w:before="0" w:after="0"/>
-              <w:jc w:val="start"/>
-            </w:pPr>
-            <w:r>
-              <w:rPr>
-                <w:rFonts w:ascii="Times New Roman" w:hAnsi="Times New Roman" w:cs="Times New Roman"/>
-                <w:sz w:val="20"/>
-                <w:szCs w:val="20"/>
-              </w:rPr>
-              <w:t xml:space="preserve">250 000</w:t>
-            </w:r>
-          </w:p>
-        </w:tc>
-        <w:tc>
-          <w:tcPr>
-            <w:tcW w:w="2500" w:type="dxa"/>
-            <w:tcBorders>
-              <w:top w:val="single" w:sz="4" w:space="0" w:color="000000"/>
-              <w:start w:val="single" w:sz="4" w:space="0" w:color="000000"/>
-              <w:bottom w:val="single" w:sz="4" w:space="0" w:color="000000"/>
-              <w:end w:val="single" w:sz="4" w:space="0" w:color="000000"/>
-            </w:tcBorders>
-          </w:tcPr>
-          <w:p>
-            <w:pPr>
-              <w:pStyle w:val="Normal"/>
-              <w:spacing w:lineRule="auto" w:line="240" w:before="0" w:after="0"/>
-              <w:jc w:val="start"/>
-            </w:pPr>
-            <w:r>
-              <w:rPr>
-                <w:rFonts w:ascii="Times New Roman" w:hAnsi="Times New Roman" w:cs="Times New Roman"/>
-                <w:sz w:val="20"/>
-                <w:szCs w:val="20"/>
-              </w:rPr>
-              <w:t xml:space="preserve">17 чел.-мес</w:t>
-            </w:r>
-          </w:p>
-        </w:tc>
-        <w:tc>
-          <w:tcPr>
-            <w:tcW w:w="2500" w:type="dxa"/>
-            <w:tcBorders>
-              <w:top w:val="single" w:sz="4" w:space="0" w:color="000000"/>
-              <w:start w:val="single" w:sz="4" w:space="0" w:color="000000"/>
-              <w:bottom w:val="single" w:sz="4" w:space="0" w:color="000000"/>
-              <w:end w:val="single" w:sz="4" w:space="0" w:color="000000"/>
-            </w:tcBorders>
-          </w:tcPr>
-          <w:p>
-            <w:pPr>
-              <w:pStyle w:val="Normal"/>
-              <w:spacing w:lineRule="auto" w:line="240" w:before="0" w:after="0"/>
-              <w:jc w:val="start"/>
-            </w:pPr>
-            <w:r>
-              <w:rPr>
-                <w:rFonts w:ascii="Times New Roman" w:hAnsi="Times New Roman" w:cs="Times New Roman"/>
-                <w:sz w:val="20"/>
-                <w:szCs w:val="20"/>
-              </w:rPr>
-              <w:t xml:space="preserve">4 250 000</w:t>
+            <w:tcW w:w="2800" w:type="dxa"/>
+            <w:tcBorders>
+              <w:top w:val="single" w:sz="4" w:space="0" w:color="000000"/>
+              <w:start w:val="single" w:sz="4" w:space="0" w:color="000000"/>
+              <w:bottom w:val="single" w:sz="4" w:space="0" w:color="000000"/>
+              <w:end w:val="single" w:sz="4" w:space="0" w:color="000000"/>
+            </w:tcBorders>
+          </w:tcPr>
+          <w:p>
+            <w:pPr>
+              <w:pStyle w:val="Normal"/>
+              <w:spacing w:lineRule="auto" w:line="240" w:before="0" w:after="0"/>
+              <w:jc w:val="start"/>
+            </w:pPr>
+            <w:r>
+              <w:rPr>
+                <w:rFonts w:ascii="Times New Roman" w:hAnsi="Times New Roman" w:cs="Times New Roman"/>
+                <w:sz w:val="20"/>
+                <w:szCs w:val="20"/>
+              </w:rPr>
+              <w:t xml:space="preserve">60 чел.-мес (нижняя)</w:t>
+            </w:r>
+          </w:p>
+        </w:tc>
+        <w:tc>
+          <w:tcPr>
+            <w:tcW w:w="2600" w:type="dxa"/>
+            <w:tcBorders>
+              <w:top w:val="single" w:sz="4" w:space="0" w:color="000000"/>
+              <w:start w:val="single" w:sz="4" w:space="0" w:color="000000"/>
+              <w:bottom w:val="single" w:sz="4" w:space="0" w:color="000000"/>
+              <w:end w:val="single" w:sz="4" w:space="0" w:color="000000"/>
+            </w:tcBorders>
+          </w:tcPr>
+          <w:p>
+            <w:pPr>
+              <w:pStyle w:val="Normal"/>
+              <w:spacing w:lineRule="auto" w:line="240" w:before="0" w:after="0"/>
+              <w:jc w:val="start"/>
+            </w:pPr>
+            <w:r>
+              <w:rPr>
+                <w:rFonts w:ascii="Times New Roman" w:hAnsi="Times New Roman" w:cs="Times New Roman"/>
+                <w:sz w:val="20"/>
+                <w:szCs w:val="20"/>
+              </w:rPr>
+              <w:t xml:space="preserve">15,0 млн ₽</w:t>
+            </w:r>
+          </w:p>
+        </w:tc>
+        <w:tc>
+          <w:tcPr>
+            <w:tcW w:w="2600" w:type="dxa"/>
+            <w:tcBorders>
+              <w:top w:val="single" w:sz="4" w:space="0" w:color="000000"/>
+              <w:start w:val="single" w:sz="4" w:space="0" w:color="000000"/>
+              <w:bottom w:val="single" w:sz="4" w:space="0" w:color="000000"/>
+              <w:end w:val="single" w:sz="4" w:space="0" w:color="000000"/>
+            </w:tcBorders>
+          </w:tcPr>
+          <w:p>
+            <w:pPr>
+              <w:pStyle w:val="Normal"/>
+              <w:spacing w:lineRule="auto" w:line="240" w:before="0" w:after="0"/>
+              <w:jc w:val="start"/>
+            </w:pPr>
+            <w:r>
+              <w:rPr>
+                <w:rFonts w:ascii="Times New Roman" w:hAnsi="Times New Roman" w:cs="Times New Roman"/>
+                <w:sz w:val="20"/>
+                <w:szCs w:val="20"/>
+              </w:rPr>
+              <w:t xml:space="preserve">21,0 млн ₽</w:t>
+            </w:r>
+          </w:p>
+        </w:tc>
+        <w:tc>
+          <w:tcPr>
+            <w:tcW w:w="2600" w:type="dxa"/>
+            <w:tcBorders>
+              <w:top w:val="single" w:sz="4" w:space="0" w:color="000000"/>
+              <w:start w:val="single" w:sz="4" w:space="0" w:color="000000"/>
+              <w:bottom w:val="single" w:sz="4" w:space="0" w:color="000000"/>
+              <w:end w:val="single" w:sz="4" w:space="0" w:color="000000"/>
+            </w:tcBorders>
+          </w:tcPr>
+          <w:p>
+            <w:pPr>
+              <w:pStyle w:val="Normal"/>
+              <w:spacing w:lineRule="auto" w:line="240" w:before="0" w:after="0"/>
+              <w:jc w:val="start"/>
+            </w:pPr>
+            <w:r>
+              <w:rPr>
+                <w:rFonts w:ascii="Times New Roman" w:hAnsi="Times New Roman" w:cs="Times New Roman"/>
+                <w:sz w:val="20"/>
+                <w:szCs w:val="20"/>
+              </w:rPr>
+              <w:t xml:space="preserve">27,0 млн ₽</w:t>
             </w:r>
           </w:p>
         </w:tc>
@@ -4700,79 +5222,105 @@
       <w:tr>
         <w:tc>
           <w:tcPr>
-            <w:tcW w:w="5200" w:type="dxa"/>
-            <w:tcBorders>
-              <w:top w:val="single" w:sz="4" w:space="0" w:color="000000"/>
-              <w:start w:val="single" w:sz="4" w:space="0" w:color="000000"/>
-              <w:bottom w:val="single" w:sz="4" w:space="0" w:color="000000"/>
-              <w:end w:val="single" w:sz="4" w:space="0" w:color="000000"/>
-            </w:tcBorders>
-          </w:tcPr>
-          <w:p>
-            <w:pPr>
-              <w:pStyle w:val="Normal"/>
-              <w:spacing w:lineRule="auto" w:line="240" w:before="0" w:after="0"/>
-              <w:jc w:val="start"/>
-            </w:pPr>
-            <w:r>
-              <w:rPr>
-                <w:rFonts w:ascii="Times New Roman" w:hAnsi="Times New Roman" w:cs="Times New Roman"/>
-                <w:sz w:val="20"/>
-                <w:szCs w:val="20"/>
-              </w:rPr>
-              <w:t xml:space="preserve">300 000</w:t>
-            </w:r>
-          </w:p>
-        </w:tc>
-        <w:tc>
-          <w:tcPr>
-            <w:tcW w:w="2500" w:type="dxa"/>
-            <w:tcBorders>
-              <w:top w:val="single" w:sz="4" w:space="0" w:color="000000"/>
-              <w:start w:val="single" w:sz="4" w:space="0" w:color="000000"/>
-              <w:bottom w:val="single" w:sz="4" w:space="0" w:color="000000"/>
-              <w:end w:val="single" w:sz="4" w:space="0" w:color="000000"/>
-            </w:tcBorders>
-          </w:tcPr>
-          <w:p>
-            <w:pPr>
-              <w:pStyle w:val="Normal"/>
-              <w:spacing w:lineRule="auto" w:line="240" w:before="0" w:after="0"/>
-              <w:jc w:val="start"/>
-            </w:pPr>
-            <w:r>
-              <w:rPr>
-                <w:rFonts w:ascii="Times New Roman" w:hAnsi="Times New Roman" w:cs="Times New Roman"/>
-                <w:sz w:val="20"/>
-                <w:szCs w:val="20"/>
-              </w:rPr>
-              <w:t xml:space="preserve">17 чел.-мес</w:t>
-            </w:r>
-          </w:p>
-        </w:tc>
-        <w:tc>
-          <w:tcPr>
-            <w:tcW w:w="2500" w:type="dxa"/>
-            <w:tcBorders>
-              <w:top w:val="single" w:sz="4" w:space="0" w:color="000000"/>
-              <w:start w:val="single" w:sz="4" w:space="0" w:color="000000"/>
-              <w:bottom w:val="single" w:sz="4" w:space="0" w:color="000000"/>
-              <w:end w:val="single" w:sz="4" w:space="0" w:color="000000"/>
-            </w:tcBorders>
-          </w:tcPr>
-          <w:p>
-            <w:pPr>
-              <w:pStyle w:val="Normal"/>
-              <w:spacing w:lineRule="auto" w:line="240" w:before="0" w:after="0"/>
-              <w:jc w:val="start"/>
-            </w:pPr>
-            <w:r>
-              <w:rPr>
-                <w:rFonts w:ascii="Times New Roman" w:hAnsi="Times New Roman" w:cs="Times New Roman"/>
-                <w:sz w:val="20"/>
-                <w:szCs w:val="20"/>
-              </w:rPr>
-              <w:t xml:space="preserve">5 100 000</w:t>
+            <w:tcW w:w="2800" w:type="dxa"/>
+            <w:tcBorders>
+              <w:top w:val="single" w:sz="4" w:space="0" w:color="000000"/>
+              <w:start w:val="single" w:sz="4" w:space="0" w:color="000000"/>
+              <w:bottom w:val="single" w:sz="4" w:space="0" w:color="000000"/>
+              <w:end w:val="single" w:sz="4" w:space="0" w:color="000000"/>
+            </w:tcBorders>
+          </w:tcPr>
+          <w:p>
+            <w:pPr>
+              <w:pStyle w:val="Normal"/>
+              <w:spacing w:lineRule="auto" w:line="240" w:before="0" w:after="0"/>
+              <w:jc w:val="start"/>
+            </w:pPr>
+            <w:r>
+              <w:rPr>
+                <w:rFonts w:ascii="Times New Roman" w:hAnsi="Times New Roman" w:cs="Times New Roman"/>
+                <w:sz w:val="20"/>
+                <w:szCs w:val="20"/>
+              </w:rPr>
+              <w:t xml:space="preserve">75 чел.-мес (центральная)</w:t>
+            </w:r>
+          </w:p>
+        </w:tc>
+        <w:tc>
+          <w:tcPr>
+            <w:tcW w:w="2600" w:type="dxa"/>
+            <w:tcBorders>
+              <w:top w:val="single" w:sz="4" w:space="0" w:color="000000"/>
+              <w:start w:val="single" w:sz="4" w:space="0" w:color="000000"/>
+              <w:bottom w:val="single" w:sz="4" w:space="0" w:color="000000"/>
+              <w:end w:val="single" w:sz="4" w:space="0" w:color="000000"/>
+            </w:tcBorders>
+          </w:tcPr>
+          <w:p>
+            <w:pPr>
+              <w:pStyle w:val="Normal"/>
+              <w:spacing w:lineRule="auto" w:line="240" w:before="0" w:after="0"/>
+              <w:jc w:val="start"/>
+            </w:pPr>
+            <w:r>
+              <w:rPr>
+                <w:rFonts w:ascii="Times New Roman" w:hAnsi="Times New Roman" w:cs="Times New Roman"/>
+                <w:sz w:val="20"/>
+                <w:szCs w:val="20"/>
+              </w:rPr>
+              <w:t xml:space="preserve">18,8 млн ₽</w:t>
+            </w:r>
+          </w:p>
+        </w:tc>
+        <w:tc>
+          <w:tcPr>
+            <w:tcW w:w="2600" w:type="dxa"/>
+            <w:tcBorders>
+              <w:top w:val="single" w:sz="4" w:space="0" w:color="000000"/>
+              <w:start w:val="single" w:sz="4" w:space="0" w:color="000000"/>
+              <w:bottom w:val="single" w:sz="4" w:space="0" w:color="000000"/>
+              <w:end w:val="single" w:sz="4" w:space="0" w:color="000000"/>
+            </w:tcBorders>
+          </w:tcPr>
+          <w:p>
+            <w:pPr>
+              <w:pStyle w:val="Normal"/>
+              <w:spacing w:lineRule="auto" w:line="240" w:before="0" w:after="0"/>
+              <w:jc w:val="start"/>
+            </w:pPr>
+            <w:r>
+              <w:rPr>
+                <w:rFonts w:ascii="Times New Roman" w:hAnsi="Times New Roman" w:cs="Times New Roman"/>
+                <w:sz w:val="20"/>
+                <w:szCs w:val="20"/>
+              </w:rPr>
+              <w:t xml:space="preserve">26,2 млн ₽</w:t>
+            </w:r>
+          </w:p>
+        </w:tc>
+        <w:tc>
+          <w:tcPr>
+            <w:tcW w:w="2600" w:type="dxa"/>
+            <w:tcBorders>
+              <w:top w:val="single" w:sz="4" w:space="0" w:color="000000"/>
+              <w:start w:val="single" w:sz="4" w:space="0" w:color="000000"/>
+              <w:bottom w:val="single" w:sz="4" w:space="0" w:color="000000"/>
+              <w:end w:val="single" w:sz="4" w:space="0" w:color="000000"/>
+            </w:tcBorders>
+          </w:tcPr>
+          <w:p>
+            <w:pPr>
+              <w:pStyle w:val="Normal"/>
+              <w:spacing w:lineRule="auto" w:line="240" w:before="0" w:after="0"/>
+              <w:jc w:val="start"/>
+            </w:pPr>
+            <w:r>
+              <w:rPr>
+                <w:rFonts w:ascii="Times New Roman" w:hAnsi="Times New Roman" w:cs="Times New Roman"/>
+                <w:sz w:val="20"/>
+                <w:szCs w:val="20"/>
+              </w:rPr>
+              <w:t xml:space="preserve">33,8 млн ₽</w:t>
             </w:r>
           </w:p>
         </w:tc>
@@ -4780,79 +5328,105 @@
       <w:tr>
         <w:tc>
           <w:tcPr>
-            <w:tcW w:w="5200" w:type="dxa"/>
-            <w:tcBorders>
-              <w:top w:val="single" w:sz="4" w:space="0" w:color="000000"/>
-              <w:start w:val="single" w:sz="4" w:space="0" w:color="000000"/>
-              <w:bottom w:val="single" w:sz="4" w:space="0" w:color="000000"/>
-              <w:end w:val="single" w:sz="4" w:space="0" w:color="000000"/>
-            </w:tcBorders>
-          </w:tcPr>
-          <w:p>
-            <w:pPr>
-              <w:pStyle w:val="Normal"/>
-              <w:spacing w:lineRule="auto" w:line="240" w:before="0" w:after="0"/>
-              <w:jc w:val="start"/>
-            </w:pPr>
-            <w:r>
-              <w:rPr>
-                <w:rFonts w:ascii="Times New Roman" w:hAnsi="Times New Roman" w:cs="Times New Roman"/>
-                <w:sz w:val="20"/>
-                <w:szCs w:val="20"/>
-              </w:rPr>
-              <w:t xml:space="preserve">400 000</w:t>
-            </w:r>
-          </w:p>
-        </w:tc>
-        <w:tc>
-          <w:tcPr>
-            <w:tcW w:w="2500" w:type="dxa"/>
-            <w:tcBorders>
-              <w:top w:val="single" w:sz="4" w:space="0" w:color="000000"/>
-              <w:start w:val="single" w:sz="4" w:space="0" w:color="000000"/>
-              <w:bottom w:val="single" w:sz="4" w:space="0" w:color="000000"/>
-              <w:end w:val="single" w:sz="4" w:space="0" w:color="000000"/>
-            </w:tcBorders>
-          </w:tcPr>
-          <w:p>
-            <w:pPr>
-              <w:pStyle w:val="Normal"/>
-              <w:spacing w:lineRule="auto" w:line="240" w:before="0" w:after="0"/>
-              <w:jc w:val="start"/>
-            </w:pPr>
-            <w:r>
-              <w:rPr>
-                <w:rFonts w:ascii="Times New Roman" w:hAnsi="Times New Roman" w:cs="Times New Roman"/>
-                <w:sz w:val="20"/>
-                <w:szCs w:val="20"/>
-              </w:rPr>
-              <w:t xml:space="preserve">17 чел.-мес</w:t>
-            </w:r>
-          </w:p>
-        </w:tc>
-        <w:tc>
-          <w:tcPr>
-            <w:tcW w:w="2500" w:type="dxa"/>
-            <w:tcBorders>
-              <w:top w:val="single" w:sz="4" w:space="0" w:color="000000"/>
-              <w:start w:val="single" w:sz="4" w:space="0" w:color="000000"/>
-              <w:bottom w:val="single" w:sz="4" w:space="0" w:color="000000"/>
-              <w:end w:val="single" w:sz="4" w:space="0" w:color="000000"/>
-            </w:tcBorders>
-          </w:tcPr>
-          <w:p>
-            <w:pPr>
-              <w:pStyle w:val="Normal"/>
-              <w:spacing w:lineRule="auto" w:line="240" w:before="0" w:after="0"/>
-              <w:jc w:val="start"/>
-            </w:pPr>
-            <w:r>
-              <w:rPr>
-                <w:rFonts w:ascii="Times New Roman" w:hAnsi="Times New Roman" w:cs="Times New Roman"/>
-                <w:sz w:val="20"/>
-                <w:szCs w:val="20"/>
-              </w:rPr>
-              <w:t xml:space="preserve">6 800 000</w:t>
+            <w:tcW w:w="2800" w:type="dxa"/>
+            <w:tcBorders>
+              <w:top w:val="single" w:sz="4" w:space="0" w:color="000000"/>
+              <w:start w:val="single" w:sz="4" w:space="0" w:color="000000"/>
+              <w:bottom w:val="single" w:sz="4" w:space="0" w:color="000000"/>
+              <w:end w:val="single" w:sz="4" w:space="0" w:color="000000"/>
+            </w:tcBorders>
+          </w:tcPr>
+          <w:p>
+            <w:pPr>
+              <w:pStyle w:val="Normal"/>
+              <w:spacing w:lineRule="auto" w:line="240" w:before="0" w:after="0"/>
+              <w:jc w:val="start"/>
+            </w:pPr>
+            <w:r>
+              <w:rPr>
+                <w:rFonts w:ascii="Times New Roman" w:hAnsi="Times New Roman" w:cs="Times New Roman"/>
+                <w:sz w:val="20"/>
+                <w:szCs w:val="20"/>
+              </w:rPr>
+              <w:t xml:space="preserve">99 чел.-мес (верхняя)</w:t>
+            </w:r>
+          </w:p>
+        </w:tc>
+        <w:tc>
+          <w:tcPr>
+            <w:tcW w:w="2600" w:type="dxa"/>
+            <w:tcBorders>
+              <w:top w:val="single" w:sz="4" w:space="0" w:color="000000"/>
+              <w:start w:val="single" w:sz="4" w:space="0" w:color="000000"/>
+              <w:bottom w:val="single" w:sz="4" w:space="0" w:color="000000"/>
+              <w:end w:val="single" w:sz="4" w:space="0" w:color="000000"/>
+            </w:tcBorders>
+          </w:tcPr>
+          <w:p>
+            <w:pPr>
+              <w:pStyle w:val="Normal"/>
+              <w:spacing w:lineRule="auto" w:line="240" w:before="0" w:after="0"/>
+              <w:jc w:val="start"/>
+            </w:pPr>
+            <w:r>
+              <w:rPr>
+                <w:rFonts w:ascii="Times New Roman" w:hAnsi="Times New Roman" w:cs="Times New Roman"/>
+                <w:sz w:val="20"/>
+                <w:szCs w:val="20"/>
+              </w:rPr>
+              <w:t xml:space="preserve">24,8 млн ₽</w:t>
+            </w:r>
+          </w:p>
+        </w:tc>
+        <w:tc>
+          <w:tcPr>
+            <w:tcW w:w="2600" w:type="dxa"/>
+            <w:tcBorders>
+              <w:top w:val="single" w:sz="4" w:space="0" w:color="000000"/>
+              <w:start w:val="single" w:sz="4" w:space="0" w:color="000000"/>
+              <w:bottom w:val="single" w:sz="4" w:space="0" w:color="000000"/>
+              <w:end w:val="single" w:sz="4" w:space="0" w:color="000000"/>
+            </w:tcBorders>
+          </w:tcPr>
+          <w:p>
+            <w:pPr>
+              <w:pStyle w:val="Normal"/>
+              <w:spacing w:lineRule="auto" w:line="240" w:before="0" w:after="0"/>
+              <w:jc w:val="start"/>
+            </w:pPr>
+            <w:r>
+              <w:rPr>
+                <w:rFonts w:ascii="Times New Roman" w:hAnsi="Times New Roman" w:cs="Times New Roman"/>
+                <w:sz w:val="20"/>
+                <w:szCs w:val="20"/>
+              </w:rPr>
+              <w:t xml:space="preserve">34,6 млн ₽</w:t>
+            </w:r>
+          </w:p>
+        </w:tc>
+        <w:tc>
+          <w:tcPr>
+            <w:tcW w:w="2600" w:type="dxa"/>
+            <w:tcBorders>
+              <w:top w:val="single" w:sz="4" w:space="0" w:color="000000"/>
+              <w:start w:val="single" w:sz="4" w:space="0" w:color="000000"/>
+              <w:bottom w:val="single" w:sz="4" w:space="0" w:color="000000"/>
+              <w:end w:val="single" w:sz="4" w:space="0" w:color="000000"/>
+            </w:tcBorders>
+          </w:tcPr>
+          <w:p>
+            <w:pPr>
+              <w:pStyle w:val="Normal"/>
+              <w:spacing w:lineRule="auto" w:line="240" w:before="0" w:after="0"/>
+              <w:jc w:val="start"/>
+            </w:pPr>
+            <w:r>
+              <w:rPr>
+                <w:rFonts w:ascii="Times New Roman" w:hAnsi="Times New Roman" w:cs="Times New Roman"/>
+                <w:sz w:val="20"/>
+                <w:szCs w:val="20"/>
+              </w:rPr>
+              <w:t xml:space="preserve">44,5 млн ₽</w:t>
             </w:r>
           </w:p>
         </w:tc>
@@ -4877,7 +5451,7 @@
           <w:sz w:val="24"/>
           <w:szCs w:val="24"/>
         </w:rPr>
-        <w:t xml:space="preserve">Диапазон по варианту А: от 4,3 до 6,8 млн ₽.</w:t>
+        <w:t xml:space="preserve">Для дальнейшего согласования принимается значение 18,8 млн ₽ — центральные трудозатраты при наименьшей из рассмотренных ставок. Выбор консервативен по отношению к матрице в целом.</w:t>
       </w:r>
     </w:p>
     <w:p>
@@ -4892,470 +5466,8 @@
           <w:sz w:val="24"/>
           <w:szCs w:val="24"/>
         </w:rPr>
-        <w:t xml:space="preserve">Вариант Б — по стоимости воссоздания комплекса сторонней командой при типовой отраслевой производительности. База: 159 189 строк исходного текста.</w:t>
+        <w:t xml:space="preserve">Фактически понесённые правообладателем затраты настоящим расчётом не определяются. При их документальном подтверждении они могут быть использованы как нижняя граница стоимости.</w:t>
       </w:r>
-    </w:p>
-    <w:tbl>
-      <w:tblPr>
-        <w:tblW w:w="10200" w:type="dxa"/>
-        <w:jc w:val="start"/>
-        <w:tblInd w:w="108" w:type="dxa"/>
-        <w:tblLayout w:type="fixed"/>
-        <w:tblCellMar>
-          <w:top w:w="0" w:type="dxa"/>
-          <w:start w:w="85" w:type="dxa"/>
-          <w:bottom w:w="0" w:type="dxa"/>
-          <w:end w:w="85" w:type="dxa"/>
-        </w:tblCellMar>
-      </w:tblPr>
-      <w:tblGrid>
-        <w:gridCol w:w="3400"/>
-        <w:gridCol w:w="2400"/>
-        <w:gridCol w:w="2200"/>
-        <w:gridCol w:w="2200"/>
-      </w:tblGrid>
-      <w:tr>
-        <w:trPr>
-          <w:tblHeader/>
-        </w:trPr>
-        <w:tc>
-          <w:tcPr>
-            <w:tcW w:w="3400" w:type="dxa"/>
-            <w:tcBorders>
-              <w:top w:val="single" w:sz="4" w:space="0" w:color="000000"/>
-              <w:start w:val="single" w:sz="4" w:space="0" w:color="000000"/>
-              <w:bottom w:val="single" w:sz="4" w:space="0" w:color="000000"/>
-              <w:end w:val="single" w:sz="4" w:space="0" w:color="000000"/>
-            </w:tcBorders>
-          </w:tcPr>
-          <w:p>
-            <w:pPr>
-              <w:pStyle w:val="Normal"/>
-              <w:spacing w:lineRule="auto" w:line="240" w:before="0" w:after="0"/>
-              <w:jc w:val="start"/>
-            </w:pPr>
-            <w:r>
-              <w:rPr>
-                <w:rFonts w:ascii="Times New Roman" w:hAnsi="Times New Roman" w:cs="Times New Roman"/>
-                <w:b/>
-                <w:bCs/>
-                <w:sz w:val="20"/>
-                <w:szCs w:val="20"/>
-              </w:rPr>
-              <w:t xml:space="preserve">Производительность</w:t>
-            </w:r>
-          </w:p>
-        </w:tc>
-        <w:tc>
-          <w:tcPr>
-            <w:tcW w:w="2400" w:type="dxa"/>
-            <w:tcBorders>
-              <w:top w:val="single" w:sz="4" w:space="0" w:color="000000"/>
-              <w:start w:val="single" w:sz="4" w:space="0" w:color="000000"/>
-              <w:bottom w:val="single" w:sz="4" w:space="0" w:color="000000"/>
-              <w:end w:val="single" w:sz="4" w:space="0" w:color="000000"/>
-            </w:tcBorders>
-          </w:tcPr>
-          <w:p>
-            <w:pPr>
-              <w:pStyle w:val="Normal"/>
-              <w:spacing w:lineRule="auto" w:line="240" w:before="0" w:after="0"/>
-              <w:jc w:val="start"/>
-            </w:pPr>
-            <w:r>
-              <w:rPr>
-                <w:rFonts w:ascii="Times New Roman" w:hAnsi="Times New Roman" w:cs="Times New Roman"/>
-                <w:b/>
-                <w:bCs/>
-                <w:sz w:val="20"/>
-                <w:szCs w:val="20"/>
-              </w:rPr>
-              <w:t xml:space="preserve">Трудозатраты</w:t>
-            </w:r>
-          </w:p>
-        </w:tc>
-        <w:tc>
-          <w:tcPr>
-            <w:tcW w:w="2200" w:type="dxa"/>
-            <w:tcBorders>
-              <w:top w:val="single" w:sz="4" w:space="0" w:color="000000"/>
-              <w:start w:val="single" w:sz="4" w:space="0" w:color="000000"/>
-              <w:bottom w:val="single" w:sz="4" w:space="0" w:color="000000"/>
-              <w:end w:val="single" w:sz="4" w:space="0" w:color="000000"/>
-            </w:tcBorders>
-          </w:tcPr>
-          <w:p>
-            <w:pPr>
-              <w:pStyle w:val="Normal"/>
-              <w:spacing w:lineRule="auto" w:line="240" w:before="0" w:after="0"/>
-              <w:jc w:val="start"/>
-            </w:pPr>
-            <w:r>
-              <w:rPr>
-                <w:rFonts w:ascii="Times New Roman" w:hAnsi="Times New Roman" w:cs="Times New Roman"/>
-                <w:b/>
-                <w:bCs/>
-                <w:sz w:val="20"/>
-                <w:szCs w:val="20"/>
-              </w:rPr>
-              <w:t xml:space="preserve">По ставке 300 000 ₽</w:t>
-            </w:r>
-          </w:p>
-        </w:tc>
-        <w:tc>
-          <w:tcPr>
-            <w:tcW w:w="2200" w:type="dxa"/>
-            <w:tcBorders>
-              <w:top w:val="single" w:sz="4" w:space="0" w:color="000000"/>
-              <w:start w:val="single" w:sz="4" w:space="0" w:color="000000"/>
-              <w:bottom w:val="single" w:sz="4" w:space="0" w:color="000000"/>
-              <w:end w:val="single" w:sz="4" w:space="0" w:color="000000"/>
-            </w:tcBorders>
-          </w:tcPr>
-          <w:p>
-            <w:pPr>
-              <w:pStyle w:val="Normal"/>
-              <w:spacing w:lineRule="auto" w:line="240" w:before="0" w:after="0"/>
-              <w:jc w:val="start"/>
-            </w:pPr>
-            <w:r>
-              <w:rPr>
-                <w:rFonts w:ascii="Times New Roman" w:hAnsi="Times New Roman" w:cs="Times New Roman"/>
-                <w:b/>
-                <w:bCs/>
-                <w:sz w:val="20"/>
-                <w:szCs w:val="20"/>
-              </w:rPr>
-              <w:t xml:space="preserve">По ставке 700 000 ₽</w:t>
-            </w:r>
-          </w:p>
-        </w:tc>
-      </w:tr>
-      <w:tr>
-        <w:tc>
-          <w:tcPr>
-            <w:tcW w:w="3400" w:type="dxa"/>
-            <w:tcBorders>
-              <w:top w:val="single" w:sz="4" w:space="0" w:color="000000"/>
-              <w:start w:val="single" w:sz="4" w:space="0" w:color="000000"/>
-              <w:bottom w:val="single" w:sz="4" w:space="0" w:color="000000"/>
-              <w:end w:val="single" w:sz="4" w:space="0" w:color="000000"/>
-            </w:tcBorders>
-          </w:tcPr>
-          <w:p>
-            <w:pPr>
-              <w:pStyle w:val="Normal"/>
-              <w:spacing w:lineRule="auto" w:line="240" w:before="0" w:after="0"/>
-              <w:jc w:val="start"/>
-            </w:pPr>
-            <w:r>
-              <w:rPr>
-                <w:rFonts w:ascii="Times New Roman" w:hAnsi="Times New Roman" w:cs="Times New Roman"/>
-                <w:sz w:val="20"/>
-                <w:szCs w:val="20"/>
-              </w:rPr>
-              <w:t xml:space="preserve">3 000 строк / чел.-мес</w:t>
-            </w:r>
-          </w:p>
-        </w:tc>
-        <w:tc>
-          <w:tcPr>
-            <w:tcW w:w="2400" w:type="dxa"/>
-            <w:tcBorders>
-              <w:top w:val="single" w:sz="4" w:space="0" w:color="000000"/>
-              <w:start w:val="single" w:sz="4" w:space="0" w:color="000000"/>
-              <w:bottom w:val="single" w:sz="4" w:space="0" w:color="000000"/>
-              <w:end w:val="single" w:sz="4" w:space="0" w:color="000000"/>
-            </w:tcBorders>
-          </w:tcPr>
-          <w:p>
-            <w:pPr>
-              <w:pStyle w:val="Normal"/>
-              <w:spacing w:lineRule="auto" w:line="240" w:before="0" w:after="0"/>
-              <w:jc w:val="start"/>
-            </w:pPr>
-            <w:r>
-              <w:rPr>
-                <w:rFonts w:ascii="Times New Roman" w:hAnsi="Times New Roman" w:cs="Times New Roman"/>
-                <w:sz w:val="20"/>
-                <w:szCs w:val="20"/>
-              </w:rPr>
-              <w:t xml:space="preserve">53 чел.-мес</w:t>
-            </w:r>
-          </w:p>
-        </w:tc>
-        <w:tc>
-          <w:tcPr>
-            <w:tcW w:w="2200" w:type="dxa"/>
-            <w:tcBorders>
-              <w:top w:val="single" w:sz="4" w:space="0" w:color="000000"/>
-              <w:start w:val="single" w:sz="4" w:space="0" w:color="000000"/>
-              <w:bottom w:val="single" w:sz="4" w:space="0" w:color="000000"/>
-              <w:end w:val="single" w:sz="4" w:space="0" w:color="000000"/>
-            </w:tcBorders>
-          </w:tcPr>
-          <w:p>
-            <w:pPr>
-              <w:pStyle w:val="Normal"/>
-              <w:spacing w:lineRule="auto" w:line="240" w:before="0" w:after="0"/>
-              <w:jc w:val="start"/>
-            </w:pPr>
-            <w:r>
-              <w:rPr>
-                <w:rFonts w:ascii="Times New Roman" w:hAnsi="Times New Roman" w:cs="Times New Roman"/>
-                <w:sz w:val="20"/>
-                <w:szCs w:val="20"/>
-              </w:rPr>
-              <w:t xml:space="preserve">15,9 млн ₽</w:t>
-            </w:r>
-          </w:p>
-        </w:tc>
-        <w:tc>
-          <w:tcPr>
-            <w:tcW w:w="2200" w:type="dxa"/>
-            <w:tcBorders>
-              <w:top w:val="single" w:sz="4" w:space="0" w:color="000000"/>
-              <w:start w:val="single" w:sz="4" w:space="0" w:color="000000"/>
-              <w:bottom w:val="single" w:sz="4" w:space="0" w:color="000000"/>
-              <w:end w:val="single" w:sz="4" w:space="0" w:color="000000"/>
-            </w:tcBorders>
-          </w:tcPr>
-          <w:p>
-            <w:pPr>
-              <w:pStyle w:val="Normal"/>
-              <w:spacing w:lineRule="auto" w:line="240" w:before="0" w:after="0"/>
-              <w:jc w:val="start"/>
-            </w:pPr>
-            <w:r>
-              <w:rPr>
-                <w:rFonts w:ascii="Times New Roman" w:hAnsi="Times New Roman" w:cs="Times New Roman"/>
-                <w:sz w:val="20"/>
-                <w:szCs w:val="20"/>
-              </w:rPr>
-              <w:t xml:space="preserve">37,1 млн ₽</w:t>
-            </w:r>
-          </w:p>
-        </w:tc>
-      </w:tr>
-      <w:tr>
-        <w:tc>
-          <w:tcPr>
-            <w:tcW w:w="3400" w:type="dxa"/>
-            <w:tcBorders>
-              <w:top w:val="single" w:sz="4" w:space="0" w:color="000000"/>
-              <w:start w:val="single" w:sz="4" w:space="0" w:color="000000"/>
-              <w:bottom w:val="single" w:sz="4" w:space="0" w:color="000000"/>
-              <w:end w:val="single" w:sz="4" w:space="0" w:color="000000"/>
-            </w:tcBorders>
-          </w:tcPr>
-          <w:p>
-            <w:pPr>
-              <w:pStyle w:val="Normal"/>
-              <w:spacing w:lineRule="auto" w:line="240" w:before="0" w:after="0"/>
-              <w:jc w:val="start"/>
-            </w:pPr>
-            <w:r>
-              <w:rPr>
-                <w:rFonts w:ascii="Times New Roman" w:hAnsi="Times New Roman" w:cs="Times New Roman"/>
-                <w:sz w:val="20"/>
-                <w:szCs w:val="20"/>
-              </w:rPr>
-              <w:t xml:space="preserve">2 500 строк / чел.-мес</w:t>
-            </w:r>
-          </w:p>
-        </w:tc>
-        <w:tc>
-          <w:tcPr>
-            <w:tcW w:w="2400" w:type="dxa"/>
-            <w:tcBorders>
-              <w:top w:val="single" w:sz="4" w:space="0" w:color="000000"/>
-              <w:start w:val="single" w:sz="4" w:space="0" w:color="000000"/>
-              <w:bottom w:val="single" w:sz="4" w:space="0" w:color="000000"/>
-              <w:end w:val="single" w:sz="4" w:space="0" w:color="000000"/>
-            </w:tcBorders>
-          </w:tcPr>
-          <w:p>
-            <w:pPr>
-              <w:pStyle w:val="Normal"/>
-              <w:spacing w:lineRule="auto" w:line="240" w:before="0" w:after="0"/>
-              <w:jc w:val="start"/>
-            </w:pPr>
-            <w:r>
-              <w:rPr>
-                <w:rFonts w:ascii="Times New Roman" w:hAnsi="Times New Roman" w:cs="Times New Roman"/>
-                <w:sz w:val="20"/>
-                <w:szCs w:val="20"/>
-              </w:rPr>
-              <w:t xml:space="preserve">64 чел.-мес</w:t>
-            </w:r>
-          </w:p>
-        </w:tc>
-        <w:tc>
-          <w:tcPr>
-            <w:tcW w:w="2200" w:type="dxa"/>
-            <w:tcBorders>
-              <w:top w:val="single" w:sz="4" w:space="0" w:color="000000"/>
-              <w:start w:val="single" w:sz="4" w:space="0" w:color="000000"/>
-              <w:bottom w:val="single" w:sz="4" w:space="0" w:color="000000"/>
-              <w:end w:val="single" w:sz="4" w:space="0" w:color="000000"/>
-            </w:tcBorders>
-          </w:tcPr>
-          <w:p>
-            <w:pPr>
-              <w:pStyle w:val="Normal"/>
-              <w:spacing w:lineRule="auto" w:line="240" w:before="0" w:after="0"/>
-              <w:jc w:val="start"/>
-            </w:pPr>
-            <w:r>
-              <w:rPr>
-                <w:rFonts w:ascii="Times New Roman" w:hAnsi="Times New Roman" w:cs="Times New Roman"/>
-                <w:sz w:val="20"/>
-                <w:szCs w:val="20"/>
-              </w:rPr>
-              <w:t xml:space="preserve">19,2 млн ₽</w:t>
-            </w:r>
-          </w:p>
-        </w:tc>
-        <w:tc>
-          <w:tcPr>
-            <w:tcW w:w="2200" w:type="dxa"/>
-            <w:tcBorders>
-              <w:top w:val="single" w:sz="4" w:space="0" w:color="000000"/>
-              <w:start w:val="single" w:sz="4" w:space="0" w:color="000000"/>
-              <w:bottom w:val="single" w:sz="4" w:space="0" w:color="000000"/>
-              <w:end w:val="single" w:sz="4" w:space="0" w:color="000000"/>
-            </w:tcBorders>
-          </w:tcPr>
-          <w:p>
-            <w:pPr>
-              <w:pStyle w:val="Normal"/>
-              <w:spacing w:lineRule="auto" w:line="240" w:before="0" w:after="0"/>
-              <w:jc w:val="start"/>
-            </w:pPr>
-            <w:r>
-              <w:rPr>
-                <w:rFonts w:ascii="Times New Roman" w:hAnsi="Times New Roman" w:cs="Times New Roman"/>
-                <w:sz w:val="20"/>
-                <w:szCs w:val="20"/>
-              </w:rPr>
-              <w:t xml:space="preserve">44,8 млн ₽</w:t>
-            </w:r>
-          </w:p>
-        </w:tc>
-      </w:tr>
-      <w:tr>
-        <w:tc>
-          <w:tcPr>
-            <w:tcW w:w="3400" w:type="dxa"/>
-            <w:tcBorders>
-              <w:top w:val="single" w:sz="4" w:space="0" w:color="000000"/>
-              <w:start w:val="single" w:sz="4" w:space="0" w:color="000000"/>
-              <w:bottom w:val="single" w:sz="4" w:space="0" w:color="000000"/>
-              <w:end w:val="single" w:sz="4" w:space="0" w:color="000000"/>
-            </w:tcBorders>
-          </w:tcPr>
-          <w:p>
-            <w:pPr>
-              <w:pStyle w:val="Normal"/>
-              <w:spacing w:lineRule="auto" w:line="240" w:before="0" w:after="0"/>
-              <w:jc w:val="start"/>
-            </w:pPr>
-            <w:r>
-              <w:rPr>
-                <w:rFonts w:ascii="Times New Roman" w:hAnsi="Times New Roman" w:cs="Times New Roman"/>
-                <w:sz w:val="20"/>
-                <w:szCs w:val="20"/>
-              </w:rPr>
-              <w:t xml:space="preserve">2 000 строк / чел.-мес</w:t>
-            </w:r>
-          </w:p>
-        </w:tc>
-        <w:tc>
-          <w:tcPr>
-            <w:tcW w:w="2400" w:type="dxa"/>
-            <w:tcBorders>
-              <w:top w:val="single" w:sz="4" w:space="0" w:color="000000"/>
-              <w:start w:val="single" w:sz="4" w:space="0" w:color="000000"/>
-              <w:bottom w:val="single" w:sz="4" w:space="0" w:color="000000"/>
-              <w:end w:val="single" w:sz="4" w:space="0" w:color="000000"/>
-            </w:tcBorders>
-          </w:tcPr>
-          <w:p>
-            <w:pPr>
-              <w:pStyle w:val="Normal"/>
-              <w:spacing w:lineRule="auto" w:line="240" w:before="0" w:after="0"/>
-              <w:jc w:val="start"/>
-            </w:pPr>
-            <w:r>
-              <w:rPr>
-                <w:rFonts w:ascii="Times New Roman" w:hAnsi="Times New Roman" w:cs="Times New Roman"/>
-                <w:sz w:val="20"/>
-                <w:szCs w:val="20"/>
-              </w:rPr>
-              <w:t xml:space="preserve">80 чел.-мес</w:t>
-            </w:r>
-          </w:p>
-        </w:tc>
-        <w:tc>
-          <w:tcPr>
-            <w:tcW w:w="2200" w:type="dxa"/>
-            <w:tcBorders>
-              <w:top w:val="single" w:sz="4" w:space="0" w:color="000000"/>
-              <w:start w:val="single" w:sz="4" w:space="0" w:color="000000"/>
-              <w:bottom w:val="single" w:sz="4" w:space="0" w:color="000000"/>
-              <w:end w:val="single" w:sz="4" w:space="0" w:color="000000"/>
-            </w:tcBorders>
-          </w:tcPr>
-          <w:p>
-            <w:pPr>
-              <w:pStyle w:val="Normal"/>
-              <w:spacing w:lineRule="auto" w:line="240" w:before="0" w:after="0"/>
-              <w:jc w:val="start"/>
-            </w:pPr>
-            <w:r>
-              <w:rPr>
-                <w:rFonts w:ascii="Times New Roman" w:hAnsi="Times New Roman" w:cs="Times New Roman"/>
-                <w:sz w:val="20"/>
-                <w:szCs w:val="20"/>
-              </w:rPr>
-              <w:t xml:space="preserve">24,0 млн ₽</w:t>
-            </w:r>
-          </w:p>
-        </w:tc>
-        <w:tc>
-          <w:tcPr>
-            <w:tcW w:w="2200" w:type="dxa"/>
-            <w:tcBorders>
-              <w:top w:val="single" w:sz="4" w:space="0" w:color="000000"/>
-              <w:start w:val="single" w:sz="4" w:space="0" w:color="000000"/>
-              <w:bottom w:val="single" w:sz="4" w:space="0" w:color="000000"/>
-              <w:end w:val="single" w:sz="4" w:space="0" w:color="000000"/>
-            </w:tcBorders>
-          </w:tcPr>
-          <w:p>
-            <w:pPr>
-              <w:pStyle w:val="Normal"/>
-              <w:spacing w:lineRule="auto" w:line="240" w:before="0" w:after="0"/>
-              <w:jc w:val="start"/>
-            </w:pPr>
-            <w:r>
-              <w:rPr>
-                <w:rFonts w:ascii="Times New Roman" w:hAnsi="Times New Roman" w:cs="Times New Roman"/>
-                <w:sz w:val="20"/>
-                <w:szCs w:val="20"/>
-              </w:rPr>
-              <w:t xml:space="preserve">56,0 млн ₽</w:t>
-            </w:r>
-          </w:p>
-        </w:tc>
-      </w:tr>
-    </w:tbl>
-    <w:p>
-      <w:pPr>
-        <w:pStyle w:val="Normal"/>
-        <w:ind w:firstLine="708"/>
-        <w:jc w:val="both"/>
-      </w:pPr>
     </w:p>
     <w:p>
       <w:pPr>
@@ -5369,22 +5481,7 @@
           <w:sz w:val="24"/>
           <w:szCs w:val="24"/>
         </w:rPr>
-        <w:t xml:space="preserve">Диапазон по варианту Б: от 15,9 до 56,0 млн ₽. Ставка 300 000 ₽ соответствует найму собственной команды, 700 000 ₽ — заказной разработке у подрядчика.</w:t>
-      </w:r>
-    </w:p>
-    <w:p>
-      <w:pPr>
-        <w:pStyle w:val="Normal"/>
-        <w:ind w:firstLine="708"/>
-        <w:jc w:val="both"/>
-      </w:pPr>
-      <w:r>
-        <w:rPr>
-          <w:rFonts w:ascii="Times New Roman" w:hAnsi="Times New Roman" w:cs="Times New Roman"/>
-          <w:sz w:val="24"/>
-          <w:szCs w:val="24"/>
-        </w:rPr>
-        <w:t xml:space="preserve">Для заявленной цели оценки — отчуждения исключительного права в полном объёме — определяющим является вариант Б: приобретатель сопоставляет цену сделки не с затратами продавца, а с затратами на самостоятельное создание равноценного комплекса. Вариант А учитывается как нижняя граница и как подтверждение реальности понесённых затрат.</w:t>
+        <w:t xml:space="preserve">Для заявленной цели оценки — отчуждения исключительного права в полном объёме — затратный подход является определяющим: приобретатель сопоставляет цену сделки с затратами на самостоятельное создание равноценного комплекса и со сроком, необходимым для такого создания.</w:t>
       </w:r>
     </w:p>
     <w:p>
@@ -6080,377 +6177,7 @@
           <w:sz w:val="24"/>
           <w:szCs w:val="24"/>
         </w:rPr>
-        <w:t xml:space="preserve">Подтверждённая история продаж у объекта оценки отсутствует, поэтому наибольший вес придаётся затратному подходу по варианту Б — стоимости создания равноценного комплекса, которая формирует верхнюю границу разумной цены для приобретателя. Доходный подход учитывается по базовому сценарию как проверочный. Затратный подход по варианту А включается с малым весом как подтверждение нижней границы. Сравнительный подход в согласовании не участвует: он обосновывает цену лицензии, а не стоимость исключительного права.</w:t>
-      </w:r>
-    </w:p>
-    <w:tbl>
-      <w:tblPr>
-        <w:tblW w:w="10700" w:type="dxa"/>
-        <w:jc w:val="start"/>
-        <w:tblInd w:w="108" w:type="dxa"/>
-        <w:tblLayout w:type="fixed"/>
-        <w:tblCellMar>
-          <w:top w:w="0" w:type="dxa"/>
-          <w:start w:w="85" w:type="dxa"/>
-          <w:bottom w:w="0" w:type="dxa"/>
-          <w:end w:w="85" w:type="dxa"/>
-        </w:tblCellMar>
-      </w:tblPr>
-      <w:tblGrid>
-        <w:gridCol w:w="4600"/>
-        <w:gridCol w:w="2700"/>
-        <w:gridCol w:w="3400"/>
-      </w:tblGrid>
-      <w:tr>
-        <w:trPr>
-          <w:tblHeader/>
-        </w:trPr>
-        <w:tc>
-          <w:tcPr>
-            <w:tcW w:w="4600" w:type="dxa"/>
-            <w:tcBorders>
-              <w:top w:val="single" w:sz="4" w:space="0" w:color="000000"/>
-              <w:start w:val="single" w:sz="4" w:space="0" w:color="000000"/>
-              <w:bottom w:val="single" w:sz="4" w:space="0" w:color="000000"/>
-              <w:end w:val="single" w:sz="4" w:space="0" w:color="000000"/>
-            </w:tcBorders>
-          </w:tcPr>
-          <w:p>
-            <w:pPr>
-              <w:pStyle w:val="Normal"/>
-              <w:spacing w:lineRule="auto" w:line="240" w:before="0" w:after="0"/>
-              <w:jc w:val="start"/>
-            </w:pPr>
-            <w:r>
-              <w:rPr>
-                <w:rFonts w:ascii="Times New Roman" w:hAnsi="Times New Roman" w:cs="Times New Roman"/>
-                <w:b/>
-                <w:bCs/>
-                <w:sz w:val="20"/>
-                <w:szCs w:val="20"/>
-              </w:rPr>
-              <w:t xml:space="preserve">Подход</w:t>
-            </w:r>
-          </w:p>
-        </w:tc>
-        <w:tc>
-          <w:tcPr>
-            <w:tcW w:w="2700" w:type="dxa"/>
-            <w:tcBorders>
-              <w:top w:val="single" w:sz="4" w:space="0" w:color="000000"/>
-              <w:start w:val="single" w:sz="4" w:space="0" w:color="000000"/>
-              <w:bottom w:val="single" w:sz="4" w:space="0" w:color="000000"/>
-              <w:end w:val="single" w:sz="4" w:space="0" w:color="000000"/>
-            </w:tcBorders>
-          </w:tcPr>
-          <w:p>
-            <w:pPr>
-              <w:pStyle w:val="Normal"/>
-              <w:spacing w:lineRule="auto" w:line="240" w:before="0" w:after="0"/>
-              <w:jc w:val="start"/>
-            </w:pPr>
-            <w:r>
-              <w:rPr>
-                <w:rFonts w:ascii="Times New Roman" w:hAnsi="Times New Roman" w:cs="Times New Roman"/>
-                <w:b/>
-                <w:bCs/>
-                <w:sz w:val="20"/>
-                <w:szCs w:val="20"/>
-              </w:rPr>
-              <w:t xml:space="preserve">Принятое значение</w:t>
-            </w:r>
-          </w:p>
-        </w:tc>
-        <w:tc>
-          <w:tcPr>
-            <w:tcW w:w="3400" w:type="dxa"/>
-            <w:tcBorders>
-              <w:top w:val="single" w:sz="4" w:space="0" w:color="000000"/>
-              <w:start w:val="single" w:sz="4" w:space="0" w:color="000000"/>
-              <w:bottom w:val="single" w:sz="4" w:space="0" w:color="000000"/>
-              <w:end w:val="single" w:sz="4" w:space="0" w:color="000000"/>
-            </w:tcBorders>
-          </w:tcPr>
-          <w:p>
-            <w:pPr>
-              <w:pStyle w:val="Normal"/>
-              <w:spacing w:lineRule="auto" w:line="240" w:before="0" w:after="0"/>
-              <w:jc w:val="start"/>
-            </w:pPr>
-            <w:r>
-              <w:rPr>
-                <w:rFonts w:ascii="Times New Roman" w:hAnsi="Times New Roman" w:cs="Times New Roman"/>
-                <w:b/>
-                <w:bCs/>
-                <w:sz w:val="20"/>
-                <w:szCs w:val="20"/>
-              </w:rPr>
-              <w:t xml:space="preserve">Обоснование веса</w:t>
-            </w:r>
-          </w:p>
-        </w:tc>
-      </w:tr>
-      <w:tr>
-        <w:tc>
-          <w:tcPr>
-            <w:tcW w:w="4600" w:type="dxa"/>
-            <w:tcBorders>
-              <w:top w:val="single" w:sz="4" w:space="0" w:color="000000"/>
-              <w:start w:val="single" w:sz="4" w:space="0" w:color="000000"/>
-              <w:bottom w:val="single" w:sz="4" w:space="0" w:color="000000"/>
-              <w:end w:val="single" w:sz="4" w:space="0" w:color="000000"/>
-            </w:tcBorders>
-          </w:tcPr>
-          <w:p>
-            <w:pPr>
-              <w:pStyle w:val="Normal"/>
-              <w:spacing w:lineRule="auto" w:line="240" w:before="0" w:after="0"/>
-              <w:jc w:val="start"/>
-            </w:pPr>
-            <w:r>
-              <w:rPr>
-                <w:rFonts w:ascii="Times New Roman" w:hAnsi="Times New Roman" w:cs="Times New Roman"/>
-                <w:sz w:val="20"/>
-                <w:szCs w:val="20"/>
-              </w:rPr>
-              <w:t xml:space="preserve">Затратный, вариант Б (воссоздание, внутренняя ставка, 65 чел.-мес)</w:t>
-            </w:r>
-          </w:p>
-        </w:tc>
-        <w:tc>
-          <w:tcPr>
-            <w:tcW w:w="2700" w:type="dxa"/>
-            <w:tcBorders>
-              <w:top w:val="single" w:sz="4" w:space="0" w:color="000000"/>
-              <w:start w:val="single" w:sz="4" w:space="0" w:color="000000"/>
-              <w:bottom w:val="single" w:sz="4" w:space="0" w:color="000000"/>
-              <w:end w:val="single" w:sz="4" w:space="0" w:color="000000"/>
-            </w:tcBorders>
-          </w:tcPr>
-          <w:p>
-            <w:pPr>
-              <w:pStyle w:val="Normal"/>
-              <w:spacing w:lineRule="auto" w:line="240" w:before="0" w:after="0"/>
-              <w:jc w:val="start"/>
-            </w:pPr>
-            <w:r>
-              <w:rPr>
-                <w:rFonts w:ascii="Times New Roman" w:hAnsi="Times New Roman" w:cs="Times New Roman"/>
-                <w:sz w:val="20"/>
-                <w:szCs w:val="20"/>
-              </w:rPr>
-              <w:t xml:space="preserve">19,5 млн ₽</w:t>
-            </w:r>
-          </w:p>
-        </w:tc>
-        <w:tc>
-          <w:tcPr>
-            <w:tcW w:w="3400" w:type="dxa"/>
-            <w:tcBorders>
-              <w:top w:val="single" w:sz="4" w:space="0" w:color="000000"/>
-              <w:start w:val="single" w:sz="4" w:space="0" w:color="000000"/>
-              <w:bottom w:val="single" w:sz="4" w:space="0" w:color="000000"/>
-              <w:end w:val="single" w:sz="4" w:space="0" w:color="000000"/>
-            </w:tcBorders>
-          </w:tcPr>
-          <w:p>
-            <w:pPr>
-              <w:pStyle w:val="Normal"/>
-              <w:spacing w:lineRule="auto" w:line="240" w:before="0" w:after="0"/>
-              <w:jc w:val="start"/>
-            </w:pPr>
-            <w:r>
-              <w:rPr>
-                <w:rFonts w:ascii="Times New Roman" w:hAnsi="Times New Roman" w:cs="Times New Roman"/>
-                <w:sz w:val="20"/>
-                <w:szCs w:val="20"/>
-              </w:rPr>
-              <w:t xml:space="preserve">Основной: определяет предел цены для приобретателя</w:t>
-            </w:r>
-          </w:p>
-        </w:tc>
-      </w:tr>
-      <w:tr>
-        <w:tc>
-          <w:tcPr>
-            <w:tcW w:w="4600" w:type="dxa"/>
-            <w:tcBorders>
-              <w:top w:val="single" w:sz="4" w:space="0" w:color="000000"/>
-              <w:start w:val="single" w:sz="4" w:space="0" w:color="000000"/>
-              <w:bottom w:val="single" w:sz="4" w:space="0" w:color="000000"/>
-              <w:end w:val="single" w:sz="4" w:space="0" w:color="000000"/>
-            </w:tcBorders>
-          </w:tcPr>
-          <w:p>
-            <w:pPr>
-              <w:pStyle w:val="Normal"/>
-              <w:spacing w:lineRule="auto" w:line="240" w:before="0" w:after="0"/>
-              <w:jc w:val="start"/>
-            </w:pPr>
-            <w:r>
-              <w:rPr>
-                <w:rFonts w:ascii="Times New Roman" w:hAnsi="Times New Roman" w:cs="Times New Roman"/>
-                <w:sz w:val="20"/>
-                <w:szCs w:val="20"/>
-              </w:rPr>
-              <w:t xml:space="preserve">Доходный, базовый сценарий</w:t>
-            </w:r>
-          </w:p>
-        </w:tc>
-        <w:tc>
-          <w:tcPr>
-            <w:tcW w:w="2700" w:type="dxa"/>
-            <w:tcBorders>
-              <w:top w:val="single" w:sz="4" w:space="0" w:color="000000"/>
-              <w:start w:val="single" w:sz="4" w:space="0" w:color="000000"/>
-              <w:bottom w:val="single" w:sz="4" w:space="0" w:color="000000"/>
-              <w:end w:val="single" w:sz="4" w:space="0" w:color="000000"/>
-            </w:tcBorders>
-          </w:tcPr>
-          <w:p>
-            <w:pPr>
-              <w:pStyle w:val="Normal"/>
-              <w:spacing w:lineRule="auto" w:line="240" w:before="0" w:after="0"/>
-              <w:jc w:val="start"/>
-            </w:pPr>
-            <w:r>
-              <w:rPr>
-                <w:rFonts w:ascii="Times New Roman" w:hAnsi="Times New Roman" w:cs="Times New Roman"/>
-                <w:sz w:val="20"/>
-                <w:szCs w:val="20"/>
-              </w:rPr>
-              <w:t xml:space="preserve">7,5 млн ₽</w:t>
-            </w:r>
-          </w:p>
-        </w:tc>
-        <w:tc>
-          <w:tcPr>
-            <w:tcW w:w="3400" w:type="dxa"/>
-            <w:tcBorders>
-              <w:top w:val="single" w:sz="4" w:space="0" w:color="000000"/>
-              <w:start w:val="single" w:sz="4" w:space="0" w:color="000000"/>
-              <w:bottom w:val="single" w:sz="4" w:space="0" w:color="000000"/>
-              <w:end w:val="single" w:sz="4" w:space="0" w:color="000000"/>
-            </w:tcBorders>
-          </w:tcPr>
-          <w:p>
-            <w:pPr>
-              <w:pStyle w:val="Normal"/>
-              <w:spacing w:lineRule="auto" w:line="240" w:before="0" w:after="0"/>
-              <w:jc w:val="start"/>
-            </w:pPr>
-            <w:r>
-              <w:rPr>
-                <w:rFonts w:ascii="Times New Roman" w:hAnsi="Times New Roman" w:cs="Times New Roman"/>
-                <w:sz w:val="20"/>
-                <w:szCs w:val="20"/>
-              </w:rPr>
-              <w:t xml:space="preserve">Проверочный: зависит от неподтверждённого плана продаж</w:t>
-            </w:r>
-          </w:p>
-        </w:tc>
-      </w:tr>
-      <w:tr>
-        <w:tc>
-          <w:tcPr>
-            <w:tcW w:w="4600" w:type="dxa"/>
-            <w:tcBorders>
-              <w:top w:val="single" w:sz="4" w:space="0" w:color="000000"/>
-              <w:start w:val="single" w:sz="4" w:space="0" w:color="000000"/>
-              <w:bottom w:val="single" w:sz="4" w:space="0" w:color="000000"/>
-              <w:end w:val="single" w:sz="4" w:space="0" w:color="000000"/>
-            </w:tcBorders>
-          </w:tcPr>
-          <w:p>
-            <w:pPr>
-              <w:pStyle w:val="Normal"/>
-              <w:spacing w:lineRule="auto" w:line="240" w:before="0" w:after="0"/>
-              <w:jc w:val="start"/>
-            </w:pPr>
-            <w:r>
-              <w:rPr>
-                <w:rFonts w:ascii="Times New Roman" w:hAnsi="Times New Roman" w:cs="Times New Roman"/>
-                <w:sz w:val="20"/>
-                <w:szCs w:val="20"/>
-              </w:rPr>
-              <w:t xml:space="preserve">Затратный, вариант А (фактические затраты)</w:t>
-            </w:r>
-          </w:p>
-        </w:tc>
-        <w:tc>
-          <w:tcPr>
-            <w:tcW w:w="2700" w:type="dxa"/>
-            <w:tcBorders>
-              <w:top w:val="single" w:sz="4" w:space="0" w:color="000000"/>
-              <w:start w:val="single" w:sz="4" w:space="0" w:color="000000"/>
-              <w:bottom w:val="single" w:sz="4" w:space="0" w:color="000000"/>
-              <w:end w:val="single" w:sz="4" w:space="0" w:color="000000"/>
-            </w:tcBorders>
-          </w:tcPr>
-          <w:p>
-            <w:pPr>
-              <w:pStyle w:val="Normal"/>
-              <w:spacing w:lineRule="auto" w:line="240" w:before="0" w:after="0"/>
-              <w:jc w:val="start"/>
-            </w:pPr>
-            <w:r>
-              <w:rPr>
-                <w:rFonts w:ascii="Times New Roman" w:hAnsi="Times New Roman" w:cs="Times New Roman"/>
-                <w:sz w:val="20"/>
-                <w:szCs w:val="20"/>
-              </w:rPr>
-              <w:t xml:space="preserve">5,1 млн ₽</w:t>
-            </w:r>
-          </w:p>
-        </w:tc>
-        <w:tc>
-          <w:tcPr>
-            <w:tcW w:w="3400" w:type="dxa"/>
-            <w:tcBorders>
-              <w:top w:val="single" w:sz="4" w:space="0" w:color="000000"/>
-              <w:start w:val="single" w:sz="4" w:space="0" w:color="000000"/>
-              <w:bottom w:val="single" w:sz="4" w:space="0" w:color="000000"/>
-              <w:end w:val="single" w:sz="4" w:space="0" w:color="000000"/>
-            </w:tcBorders>
-          </w:tcPr>
-          <w:p>
-            <w:pPr>
-              <w:pStyle w:val="Normal"/>
-              <w:spacing w:lineRule="auto" w:line="240" w:before="0" w:after="0"/>
-              <w:jc w:val="start"/>
-            </w:pPr>
-            <w:r>
-              <w:rPr>
-                <w:rFonts w:ascii="Times New Roman" w:hAnsi="Times New Roman" w:cs="Times New Roman"/>
-                <w:sz w:val="20"/>
-                <w:szCs w:val="20"/>
-              </w:rPr>
-              <w:t xml:space="preserve">Вспомогательный: нижняя граница</w:t>
-            </w:r>
-          </w:p>
-        </w:tc>
-      </w:tr>
-    </w:tbl>
-    <w:p>
-      <w:pPr>
-        <w:pStyle w:val="Normal"/>
-        <w:ind w:firstLine="708"/>
-        <w:jc w:val="both"/>
-      </w:pPr>
-    </w:p>
-    <w:p>
-      <w:pPr>
-        <w:pStyle w:val="Normal"/>
-        <w:ind w:firstLine="708"/>
-        <w:jc w:val="both"/>
-      </w:pPr>
-      <w:r>
-        <w:rPr>
-          <w:rFonts w:ascii="Times New Roman" w:hAnsi="Times New Roman" w:cs="Times New Roman"/>
-          <w:sz w:val="24"/>
-          <w:szCs w:val="24"/>
-        </w:rPr>
-        <w:t xml:space="preserve">Результат согласования при различных наборах весов (вариант Б / вариант А / доходный подход):</w:t>
+        <w:t xml:space="preserve">Подтверждённая история продаж у объекта оценки отсутствует, поэтому определяющим принимается затратный подход, формирующий предел разумной цены для приобретателя. Доходный подход по базовому сценарию учитывается как проверочный. Сравнительный подход в согласовании не участвует: он обосновывает цену лицензии, а не стоимость исключительного права.</w:t>
       </w:r>
     </w:p>
     <w:tbl>
@@ -6499,7 +6226,7 @@
                 <w:sz w:val="20"/>
                 <w:szCs w:val="20"/>
               </w:rPr>
-              <w:t xml:space="preserve">Набор весов</w:t>
+              <w:t xml:space="preserve">Подход</w:t>
             </w:r>
           </w:p>
         </w:tc>
@@ -6527,7 +6254,7 @@
                 <w:sz w:val="20"/>
                 <w:szCs w:val="20"/>
               </w:rPr>
-              <w:t xml:space="preserve">Согласованная стоимость</w:t>
+              <w:t xml:space="preserve">Принятое значение</w:t>
             </w:r>
           </w:p>
         </w:tc>
@@ -6555,7 +6282,7 @@
                 <w:sz w:val="20"/>
                 <w:szCs w:val="20"/>
               </w:rPr>
-              <w:t xml:space="preserve">Характер набора</w:t>
+              <w:t xml:space="preserve">Роль в согласовании</w:t>
             </w:r>
           </w:p>
         </w:tc>
@@ -6583,7 +6310,7 @@
                 <w:sz w:val="20"/>
                 <w:szCs w:val="20"/>
               </w:rPr>
-              <w:t xml:space="preserve">40 % / 30 % / 30 %</w:t>
+              <w:t xml:space="preserve">Затратный (нормативные трудозатраты, 75 чел.-мес, ставка 250 000 ₽)</w:t>
             </w:r>
           </w:p>
         </w:tc>
@@ -6609,7 +6336,7 @@
                 <w:sz w:val="20"/>
                 <w:szCs w:val="20"/>
               </w:rPr>
-              <w:t xml:space="preserve">11,6 млн ₽</w:t>
+              <w:t xml:space="preserve">18,8 млн ₽</w:t>
             </w:r>
           </w:p>
         </w:tc>
@@ -6635,7 +6362,7 @@
                 <w:sz w:val="20"/>
                 <w:szCs w:val="20"/>
               </w:rPr>
-              <w:t xml:space="preserve">Консервативный</w:t>
+              <w:t xml:space="preserve">Определяющий</w:t>
             </w:r>
           </w:p>
         </w:tc>
@@ -6663,7 +6390,7 @@
                 <w:sz w:val="20"/>
                 <w:szCs w:val="20"/>
               </w:rPr>
-              <w:t xml:space="preserve">50 % / 20 % / 30 %</w:t>
+              <w:t xml:space="preserve">Доходный (базовый сценарий продаж)</w:t>
             </w:r>
           </w:p>
         </w:tc>
@@ -6689,7 +6416,7 @@
                 <w:sz w:val="20"/>
                 <w:szCs w:val="20"/>
               </w:rPr>
-              <w:t xml:space="preserve">13,0 млн ₽</w:t>
+              <w:t xml:space="preserve">7,5 млн ₽</w:t>
             </w:r>
           </w:p>
         </w:tc>
@@ -6715,7 +6442,7 @@
                 <w:sz w:val="20"/>
                 <w:szCs w:val="20"/>
               </w:rPr>
-              <w:t xml:space="preserve">Сбалансированный</w:t>
+              <w:t xml:space="preserve">Проверочный</w:t>
             </w:r>
           </w:p>
         </w:tc>
@@ -6743,7 +6470,7 @@
                 <w:sz w:val="20"/>
                 <w:szCs w:val="20"/>
               </w:rPr>
-              <w:t xml:space="preserve">60 % / 10 % / 30 %</w:t>
+              <w:t xml:space="preserve">Сравнительный</w:t>
             </w:r>
           </w:p>
         </w:tc>
@@ -6769,7 +6496,7 @@
                 <w:sz w:val="20"/>
                 <w:szCs w:val="20"/>
               </w:rPr>
-              <w:t xml:space="preserve">14,5 млн ₽</w:t>
+              <w:t xml:space="preserve">цена лицензии 60–80 тыс. ₽</w:t>
             </w:r>
           </w:p>
         </w:tc>
@@ -6795,87 +6522,7 @@
                 <w:sz w:val="20"/>
                 <w:szCs w:val="20"/>
               </w:rPr>
-              <w:t xml:space="preserve">С приоритетом стоимости воссоздания</w:t>
-            </w:r>
-          </w:p>
-        </w:tc>
-      </w:tr>
-      <w:tr>
-        <w:tc>
-          <w:tcPr>
-            <w:tcW w:w="4600" w:type="dxa"/>
-            <w:tcBorders>
-              <w:top w:val="single" w:sz="4" w:space="0" w:color="000000"/>
-              <w:start w:val="single" w:sz="4" w:space="0" w:color="000000"/>
-              <w:bottom w:val="single" w:sz="4" w:space="0" w:color="000000"/>
-              <w:end w:val="single" w:sz="4" w:space="0" w:color="000000"/>
-            </w:tcBorders>
-          </w:tcPr>
-          <w:p>
-            <w:pPr>
-              <w:pStyle w:val="Normal"/>
-              <w:spacing w:lineRule="auto" w:line="240" w:before="0" w:after="0"/>
-              <w:jc w:val="start"/>
-            </w:pPr>
-            <w:r>
-              <w:rPr>
-                <w:rFonts w:ascii="Times New Roman" w:hAnsi="Times New Roman" w:cs="Times New Roman"/>
-                <w:sz w:val="20"/>
-                <w:szCs w:val="20"/>
-              </w:rPr>
-              <w:t xml:space="preserve">70 % / 10 % / 20 %</w:t>
-            </w:r>
-          </w:p>
-        </w:tc>
-        <w:tc>
-          <w:tcPr>
-            <w:tcW w:w="3000" w:type="dxa"/>
-            <w:tcBorders>
-              <w:top w:val="single" w:sz="4" w:space="0" w:color="000000"/>
-              <w:start w:val="single" w:sz="4" w:space="0" w:color="000000"/>
-              <w:bottom w:val="single" w:sz="4" w:space="0" w:color="000000"/>
-              <w:end w:val="single" w:sz="4" w:space="0" w:color="000000"/>
-            </w:tcBorders>
-          </w:tcPr>
-          <w:p>
-            <w:pPr>
-              <w:pStyle w:val="Normal"/>
-              <w:spacing w:lineRule="auto" w:line="240" w:before="0" w:after="0"/>
-              <w:jc w:val="start"/>
-            </w:pPr>
-            <w:r>
-              <w:rPr>
-                <w:rFonts w:ascii="Times New Roman" w:hAnsi="Times New Roman" w:cs="Times New Roman"/>
-                <w:sz w:val="20"/>
-                <w:szCs w:val="20"/>
-              </w:rPr>
-              <w:t xml:space="preserve">15,7 млн ₽</w:t>
-            </w:r>
-          </w:p>
-        </w:tc>
-        <w:tc>
-          <w:tcPr>
-            <w:tcW w:w="3100" w:type="dxa"/>
-            <w:tcBorders>
-              <w:top w:val="single" w:sz="4" w:space="0" w:color="000000"/>
-              <w:start w:val="single" w:sz="4" w:space="0" w:color="000000"/>
-              <w:bottom w:val="single" w:sz="4" w:space="0" w:color="000000"/>
-              <w:end w:val="single" w:sz="4" w:space="0" w:color="000000"/>
-            </w:tcBorders>
-          </w:tcPr>
-          <w:p>
-            <w:pPr>
-              <w:pStyle w:val="Normal"/>
-              <w:spacing w:lineRule="auto" w:line="240" w:before="0" w:after="0"/>
-              <w:jc w:val="start"/>
-            </w:pPr>
-            <w:r>
-              <w:rPr>
-                <w:rFonts w:ascii="Times New Roman" w:hAnsi="Times New Roman" w:cs="Times New Roman"/>
-                <w:sz w:val="20"/>
-                <w:szCs w:val="20"/>
-              </w:rPr>
-              <w:t xml:space="preserve">С минимальным учётом доходного подхода</w:t>
+              <w:t xml:space="preserve">Не участвует в согласовании</w:t>
             </w:r>
           </w:p>
         </w:tc>
@@ -6900,7 +6547,7 @@
           <w:sz w:val="24"/>
           <w:szCs w:val="24"/>
         </w:rPr>
-        <w:t xml:space="preserve">Чувствительность к базе затратного подхода по варианту Б при весах 50 / 20 / 30:</w:t>
+        <w:t xml:space="preserve">Результат согласования при различных наборах весов (затратный подход / доходный подход):</w:t>
       </w:r>
     </w:p>
     <w:tbl>
@@ -6949,7 +6596,7 @@
                 <w:sz w:val="20"/>
                 <w:szCs w:val="20"/>
               </w:rPr>
-              <w:t xml:space="preserve">База воссоздания</w:t>
+              <w:t xml:space="preserve">Набор весов</w:t>
             </w:r>
           </w:p>
         </w:tc>
@@ -6977,7 +6624,7 @@
                 <w:sz w:val="20"/>
                 <w:szCs w:val="20"/>
               </w:rPr>
-              <w:t xml:space="preserve">Трудозатраты</w:t>
+              <w:t xml:space="preserve">Согласованная стоимость</w:t>
             </w:r>
           </w:p>
         </w:tc>
@@ -7005,7 +6652,7 @@
                 <w:sz w:val="20"/>
                 <w:szCs w:val="20"/>
               </w:rPr>
-              <w:t xml:space="preserve">Согласованная стоимость</w:t>
+              <w:t xml:space="preserve">Характер набора</w:t>
             </w:r>
           </w:p>
         </w:tc>
@@ -7033,7 +6680,7 @@
                 <w:sz w:val="20"/>
                 <w:szCs w:val="20"/>
               </w:rPr>
-              <w:t xml:space="preserve">15,9 млн ₽ (нижняя)</w:t>
+              <w:t xml:space="preserve">40 % / 60 %</w:t>
             </w:r>
           </w:p>
         </w:tc>
@@ -7059,7 +6706,7 @@
                 <w:sz w:val="20"/>
                 <w:szCs w:val="20"/>
               </w:rPr>
-              <w:t xml:space="preserve">53 чел.-мес</w:t>
+              <w:t xml:space="preserve">12,0 млн ₽</w:t>
             </w:r>
           </w:p>
         </w:tc>
@@ -7085,7 +6732,7 @@
                 <w:sz w:val="20"/>
                 <w:szCs w:val="20"/>
               </w:rPr>
-              <w:t xml:space="preserve">11,2 млн ₽</w:t>
+              <w:t xml:space="preserve">С приоритетом доходного подхода</w:t>
             </w:r>
           </w:p>
         </w:tc>
@@ -7113,7 +6760,7 @@
                 <w:sz w:val="20"/>
                 <w:szCs w:val="20"/>
               </w:rPr>
-              <w:t xml:space="preserve">19,5 млн ₽ (средняя)</w:t>
+              <w:t xml:space="preserve">50 % / 50 %</w:t>
             </w:r>
           </w:p>
         </w:tc>
@@ -7139,7 +6786,7 @@
                 <w:sz w:val="20"/>
                 <w:szCs w:val="20"/>
               </w:rPr>
-              <w:t xml:space="preserve">65 чел.-мес</w:t>
+              <w:t xml:space="preserve">13,2 млн ₽</w:t>
             </w:r>
           </w:p>
         </w:tc>
@@ -7165,7 +6812,7 @@
                 <w:sz w:val="20"/>
                 <w:szCs w:val="20"/>
               </w:rPr>
-              <w:t xml:space="preserve">13,0 млн ₽</w:t>
+              <w:t xml:space="preserve">Равновесный</w:t>
             </w:r>
           </w:p>
         </w:tc>
@@ -7193,7 +6840,7 @@
                 <w:sz w:val="20"/>
                 <w:szCs w:val="20"/>
               </w:rPr>
-              <w:t xml:space="preserve">24,0 млн ₽ (верхняя)</w:t>
+              <w:t xml:space="preserve">60 % / 40 %</w:t>
             </w:r>
           </w:p>
         </w:tc>
@@ -7219,7 +6866,7 @@
                 <w:sz w:val="20"/>
                 <w:szCs w:val="20"/>
               </w:rPr>
-              <w:t xml:space="preserve">80 чел.-мес</w:t>
+              <w:t xml:space="preserve">14,3 млн ₽</w:t>
             </w:r>
           </w:p>
         </w:tc>
@@ -7245,7 +6892,457 @@
                 <w:sz w:val="20"/>
                 <w:szCs w:val="20"/>
               </w:rPr>
-              <w:t xml:space="preserve">15,3 млн ₽</w:t>
+              <w:t xml:space="preserve">Сбалансированный с учётом отсутствия продаж</w:t>
+            </w:r>
+          </w:p>
+        </w:tc>
+      </w:tr>
+      <w:tr>
+        <w:tc>
+          <w:tcPr>
+            <w:tcW w:w="4600" w:type="dxa"/>
+            <w:tcBorders>
+              <w:top w:val="single" w:sz="4" w:space="0" w:color="000000"/>
+              <w:start w:val="single" w:sz="4" w:space="0" w:color="000000"/>
+              <w:bottom w:val="single" w:sz="4" w:space="0" w:color="000000"/>
+              <w:end w:val="single" w:sz="4" w:space="0" w:color="000000"/>
+            </w:tcBorders>
+          </w:tcPr>
+          <w:p>
+            <w:pPr>
+              <w:pStyle w:val="Normal"/>
+              <w:spacing w:lineRule="auto" w:line="240" w:before="0" w:after="0"/>
+              <w:jc w:val="start"/>
+            </w:pPr>
+            <w:r>
+              <w:rPr>
+                <w:rFonts w:ascii="Times New Roman" w:hAnsi="Times New Roman" w:cs="Times New Roman"/>
+                <w:sz w:val="20"/>
+                <w:szCs w:val="20"/>
+              </w:rPr>
+              <w:t xml:space="preserve">70 % / 30 %</w:t>
+            </w:r>
+          </w:p>
+        </w:tc>
+        <w:tc>
+          <w:tcPr>
+            <w:tcW w:w="3000" w:type="dxa"/>
+            <w:tcBorders>
+              <w:top w:val="single" w:sz="4" w:space="0" w:color="000000"/>
+              <w:start w:val="single" w:sz="4" w:space="0" w:color="000000"/>
+              <w:bottom w:val="single" w:sz="4" w:space="0" w:color="000000"/>
+              <w:end w:val="single" w:sz="4" w:space="0" w:color="000000"/>
+            </w:tcBorders>
+          </w:tcPr>
+          <w:p>
+            <w:pPr>
+              <w:pStyle w:val="Normal"/>
+              <w:spacing w:lineRule="auto" w:line="240" w:before="0" w:after="0"/>
+              <w:jc w:val="start"/>
+            </w:pPr>
+            <w:r>
+              <w:rPr>
+                <w:rFonts w:ascii="Times New Roman" w:hAnsi="Times New Roman" w:cs="Times New Roman"/>
+                <w:sz w:val="20"/>
+                <w:szCs w:val="20"/>
+              </w:rPr>
+              <w:t xml:space="preserve">15,4 млн ₽</w:t>
+            </w:r>
+          </w:p>
+        </w:tc>
+        <w:tc>
+          <w:tcPr>
+            <w:tcW w:w="3100" w:type="dxa"/>
+            <w:tcBorders>
+              <w:top w:val="single" w:sz="4" w:space="0" w:color="000000"/>
+              <w:start w:val="single" w:sz="4" w:space="0" w:color="000000"/>
+              <w:bottom w:val="single" w:sz="4" w:space="0" w:color="000000"/>
+              <w:end w:val="single" w:sz="4" w:space="0" w:color="000000"/>
+            </w:tcBorders>
+          </w:tcPr>
+          <w:p>
+            <w:pPr>
+              <w:pStyle w:val="Normal"/>
+              <w:spacing w:lineRule="auto" w:line="240" w:before="0" w:after="0"/>
+              <w:jc w:val="start"/>
+            </w:pPr>
+            <w:r>
+              <w:rPr>
+                <w:rFonts w:ascii="Times New Roman" w:hAnsi="Times New Roman" w:cs="Times New Roman"/>
+                <w:sz w:val="20"/>
+                <w:szCs w:val="20"/>
+              </w:rPr>
+              <w:t xml:space="preserve">С приоритетом затратного подхода</w:t>
+            </w:r>
+          </w:p>
+        </w:tc>
+      </w:tr>
+    </w:tbl>
+    <w:p>
+      <w:pPr>
+        <w:pStyle w:val="Normal"/>
+        <w:ind w:firstLine="708"/>
+        <w:jc w:val="both"/>
+      </w:pPr>
+    </w:p>
+    <w:p>
+      <w:pPr>
+        <w:pStyle w:val="Normal"/>
+        <w:ind w:firstLine="708"/>
+        <w:jc w:val="both"/>
+      </w:pPr>
+      <w:r>
+        <w:rPr>
+          <w:rFonts w:ascii="Times New Roman" w:hAnsi="Times New Roman" w:cs="Times New Roman"/>
+          <w:sz w:val="24"/>
+          <w:szCs w:val="24"/>
+        </w:rPr>
+        <w:t xml:space="preserve">Чувствительность к базе затратного подхода при весах 60 / 40:</w:t>
+      </w:r>
+    </w:p>
+    <w:tbl>
+      <w:tblPr>
+        <w:tblW w:w="10700" w:type="dxa"/>
+        <w:jc w:val="start"/>
+        <w:tblInd w:w="108" w:type="dxa"/>
+        <w:tblLayout w:type="fixed"/>
+        <w:tblCellMar>
+          <w:top w:w="0" w:type="dxa"/>
+          <w:start w:w="85" w:type="dxa"/>
+          <w:bottom w:w="0" w:type="dxa"/>
+          <w:end w:w="85" w:type="dxa"/>
+        </w:tblCellMar>
+      </w:tblPr>
+      <w:tblGrid>
+        <w:gridCol w:w="4600"/>
+        <w:gridCol w:w="3000"/>
+        <w:gridCol w:w="3100"/>
+      </w:tblGrid>
+      <w:tr>
+        <w:trPr>
+          <w:tblHeader/>
+        </w:trPr>
+        <w:tc>
+          <w:tcPr>
+            <w:tcW w:w="4600" w:type="dxa"/>
+            <w:tcBorders>
+              <w:top w:val="single" w:sz="4" w:space="0" w:color="000000"/>
+              <w:start w:val="single" w:sz="4" w:space="0" w:color="000000"/>
+              <w:bottom w:val="single" w:sz="4" w:space="0" w:color="000000"/>
+              <w:end w:val="single" w:sz="4" w:space="0" w:color="000000"/>
+            </w:tcBorders>
+          </w:tcPr>
+          <w:p>
+            <w:pPr>
+              <w:pStyle w:val="Normal"/>
+              <w:spacing w:lineRule="auto" w:line="240" w:before="0" w:after="0"/>
+              <w:jc w:val="start"/>
+            </w:pPr>
+            <w:r>
+              <w:rPr>
+                <w:rFonts w:ascii="Times New Roman" w:hAnsi="Times New Roman" w:cs="Times New Roman"/>
+                <w:b/>
+                <w:bCs/>
+                <w:sz w:val="20"/>
+                <w:szCs w:val="20"/>
+              </w:rPr>
+              <w:t xml:space="preserve">База затратного подхода</w:t>
+            </w:r>
+          </w:p>
+        </w:tc>
+        <w:tc>
+          <w:tcPr>
+            <w:tcW w:w="3000" w:type="dxa"/>
+            <w:tcBorders>
+              <w:top w:val="single" w:sz="4" w:space="0" w:color="000000"/>
+              <w:start w:val="single" w:sz="4" w:space="0" w:color="000000"/>
+              <w:bottom w:val="single" w:sz="4" w:space="0" w:color="000000"/>
+              <w:end w:val="single" w:sz="4" w:space="0" w:color="000000"/>
+            </w:tcBorders>
+          </w:tcPr>
+          <w:p>
+            <w:pPr>
+              <w:pStyle w:val="Normal"/>
+              <w:spacing w:lineRule="auto" w:line="240" w:before="0" w:after="0"/>
+              <w:jc w:val="start"/>
+            </w:pPr>
+            <w:r>
+              <w:rPr>
+                <w:rFonts w:ascii="Times New Roman" w:hAnsi="Times New Roman" w:cs="Times New Roman"/>
+                <w:b/>
+                <w:bCs/>
+                <w:sz w:val="20"/>
+                <w:szCs w:val="20"/>
+              </w:rPr>
+              <w:t xml:space="preserve">Трудозатраты</w:t>
+            </w:r>
+          </w:p>
+        </w:tc>
+        <w:tc>
+          <w:tcPr>
+            <w:tcW w:w="3100" w:type="dxa"/>
+            <w:tcBorders>
+              <w:top w:val="single" w:sz="4" w:space="0" w:color="000000"/>
+              <w:start w:val="single" w:sz="4" w:space="0" w:color="000000"/>
+              <w:bottom w:val="single" w:sz="4" w:space="0" w:color="000000"/>
+              <w:end w:val="single" w:sz="4" w:space="0" w:color="000000"/>
+            </w:tcBorders>
+          </w:tcPr>
+          <w:p>
+            <w:pPr>
+              <w:pStyle w:val="Normal"/>
+              <w:spacing w:lineRule="auto" w:line="240" w:before="0" w:after="0"/>
+              <w:jc w:val="start"/>
+            </w:pPr>
+            <w:r>
+              <w:rPr>
+                <w:rFonts w:ascii="Times New Roman" w:hAnsi="Times New Roman" w:cs="Times New Roman"/>
+                <w:b/>
+                <w:bCs/>
+                <w:sz w:val="20"/>
+                <w:szCs w:val="20"/>
+              </w:rPr>
+              <w:t xml:space="preserve">Согласованная стоимость</w:t>
+            </w:r>
+          </w:p>
+        </w:tc>
+      </w:tr>
+      <w:tr>
+        <w:tc>
+          <w:tcPr>
+            <w:tcW w:w="4600" w:type="dxa"/>
+            <w:tcBorders>
+              <w:top w:val="single" w:sz="4" w:space="0" w:color="000000"/>
+              <w:start w:val="single" w:sz="4" w:space="0" w:color="000000"/>
+              <w:bottom w:val="single" w:sz="4" w:space="0" w:color="000000"/>
+              <w:end w:val="single" w:sz="4" w:space="0" w:color="000000"/>
+            </w:tcBorders>
+          </w:tcPr>
+          <w:p>
+            <w:pPr>
+              <w:pStyle w:val="Normal"/>
+              <w:spacing w:lineRule="auto" w:line="240" w:before="0" w:after="0"/>
+              <w:jc w:val="start"/>
+            </w:pPr>
+            <w:r>
+              <w:rPr>
+                <w:rFonts w:ascii="Times New Roman" w:hAnsi="Times New Roman" w:cs="Times New Roman"/>
+                <w:sz w:val="20"/>
+                <w:szCs w:val="20"/>
+              </w:rPr>
+              <w:t xml:space="preserve">15,0 млн ₽</w:t>
+            </w:r>
+          </w:p>
+        </w:tc>
+        <w:tc>
+          <w:tcPr>
+            <w:tcW w:w="3000" w:type="dxa"/>
+            <w:tcBorders>
+              <w:top w:val="single" w:sz="4" w:space="0" w:color="000000"/>
+              <w:start w:val="single" w:sz="4" w:space="0" w:color="000000"/>
+              <w:bottom w:val="single" w:sz="4" w:space="0" w:color="000000"/>
+              <w:end w:val="single" w:sz="4" w:space="0" w:color="000000"/>
+            </w:tcBorders>
+          </w:tcPr>
+          <w:p>
+            <w:pPr>
+              <w:pStyle w:val="Normal"/>
+              <w:spacing w:lineRule="auto" w:line="240" w:before="0" w:after="0"/>
+              <w:jc w:val="start"/>
+            </w:pPr>
+            <w:r>
+              <w:rPr>
+                <w:rFonts w:ascii="Times New Roman" w:hAnsi="Times New Roman" w:cs="Times New Roman"/>
+                <w:sz w:val="20"/>
+                <w:szCs w:val="20"/>
+              </w:rPr>
+              <w:t xml:space="preserve">60 чел.-мес</w:t>
+            </w:r>
+          </w:p>
+        </w:tc>
+        <w:tc>
+          <w:tcPr>
+            <w:tcW w:w="3100" w:type="dxa"/>
+            <w:tcBorders>
+              <w:top w:val="single" w:sz="4" w:space="0" w:color="000000"/>
+              <w:start w:val="single" w:sz="4" w:space="0" w:color="000000"/>
+              <w:bottom w:val="single" w:sz="4" w:space="0" w:color="000000"/>
+              <w:end w:val="single" w:sz="4" w:space="0" w:color="000000"/>
+            </w:tcBorders>
+          </w:tcPr>
+          <w:p>
+            <w:pPr>
+              <w:pStyle w:val="Normal"/>
+              <w:spacing w:lineRule="auto" w:line="240" w:before="0" w:after="0"/>
+              <w:jc w:val="start"/>
+            </w:pPr>
+            <w:r>
+              <w:rPr>
+                <w:rFonts w:ascii="Times New Roman" w:hAnsi="Times New Roman" w:cs="Times New Roman"/>
+                <w:sz w:val="20"/>
+                <w:szCs w:val="20"/>
+              </w:rPr>
+              <w:t xml:space="preserve">12,0 млн ₽</w:t>
+            </w:r>
+          </w:p>
+        </w:tc>
+      </w:tr>
+      <w:tr>
+        <w:tc>
+          <w:tcPr>
+            <w:tcW w:w="4600" w:type="dxa"/>
+            <w:tcBorders>
+              <w:top w:val="single" w:sz="4" w:space="0" w:color="000000"/>
+              <w:start w:val="single" w:sz="4" w:space="0" w:color="000000"/>
+              <w:bottom w:val="single" w:sz="4" w:space="0" w:color="000000"/>
+              <w:end w:val="single" w:sz="4" w:space="0" w:color="000000"/>
+            </w:tcBorders>
+          </w:tcPr>
+          <w:p>
+            <w:pPr>
+              <w:pStyle w:val="Normal"/>
+              <w:spacing w:lineRule="auto" w:line="240" w:before="0" w:after="0"/>
+              <w:jc w:val="start"/>
+            </w:pPr>
+            <w:r>
+              <w:rPr>
+                <w:rFonts w:ascii="Times New Roman" w:hAnsi="Times New Roman" w:cs="Times New Roman"/>
+                <w:sz w:val="20"/>
+                <w:szCs w:val="20"/>
+              </w:rPr>
+              <w:t xml:space="preserve">18,8 млн ₽</w:t>
+            </w:r>
+          </w:p>
+        </w:tc>
+        <w:tc>
+          <w:tcPr>
+            <w:tcW w:w="3000" w:type="dxa"/>
+            <w:tcBorders>
+              <w:top w:val="single" w:sz="4" w:space="0" w:color="000000"/>
+              <w:start w:val="single" w:sz="4" w:space="0" w:color="000000"/>
+              <w:bottom w:val="single" w:sz="4" w:space="0" w:color="000000"/>
+              <w:end w:val="single" w:sz="4" w:space="0" w:color="000000"/>
+            </w:tcBorders>
+          </w:tcPr>
+          <w:p>
+            <w:pPr>
+              <w:pStyle w:val="Normal"/>
+              <w:spacing w:lineRule="auto" w:line="240" w:before="0" w:after="0"/>
+              <w:jc w:val="start"/>
+            </w:pPr>
+            <w:r>
+              <w:rPr>
+                <w:rFonts w:ascii="Times New Roman" w:hAnsi="Times New Roman" w:cs="Times New Roman"/>
+                <w:sz w:val="20"/>
+                <w:szCs w:val="20"/>
+              </w:rPr>
+              <w:t xml:space="preserve">75 чел.-мес</w:t>
+            </w:r>
+          </w:p>
+        </w:tc>
+        <w:tc>
+          <w:tcPr>
+            <w:tcW w:w="3100" w:type="dxa"/>
+            <w:tcBorders>
+              <w:top w:val="single" w:sz="4" w:space="0" w:color="000000"/>
+              <w:start w:val="single" w:sz="4" w:space="0" w:color="000000"/>
+              <w:bottom w:val="single" w:sz="4" w:space="0" w:color="000000"/>
+              <w:end w:val="single" w:sz="4" w:space="0" w:color="000000"/>
+            </w:tcBorders>
+          </w:tcPr>
+          <w:p>
+            <w:pPr>
+              <w:pStyle w:val="Normal"/>
+              <w:spacing w:lineRule="auto" w:line="240" w:before="0" w:after="0"/>
+              <w:jc w:val="start"/>
+            </w:pPr>
+            <w:r>
+              <w:rPr>
+                <w:rFonts w:ascii="Times New Roman" w:hAnsi="Times New Roman" w:cs="Times New Roman"/>
+                <w:sz w:val="20"/>
+                <w:szCs w:val="20"/>
+              </w:rPr>
+              <w:t xml:space="preserve">14,3 млн ₽</w:t>
+            </w:r>
+          </w:p>
+        </w:tc>
+      </w:tr>
+      <w:tr>
+        <w:tc>
+          <w:tcPr>
+            <w:tcW w:w="4600" w:type="dxa"/>
+            <w:tcBorders>
+              <w:top w:val="single" w:sz="4" w:space="0" w:color="000000"/>
+              <w:start w:val="single" w:sz="4" w:space="0" w:color="000000"/>
+              <w:bottom w:val="single" w:sz="4" w:space="0" w:color="000000"/>
+              <w:end w:val="single" w:sz="4" w:space="0" w:color="000000"/>
+            </w:tcBorders>
+          </w:tcPr>
+          <w:p>
+            <w:pPr>
+              <w:pStyle w:val="Normal"/>
+              <w:spacing w:lineRule="auto" w:line="240" w:before="0" w:after="0"/>
+              <w:jc w:val="start"/>
+            </w:pPr>
+            <w:r>
+              <w:rPr>
+                <w:rFonts w:ascii="Times New Roman" w:hAnsi="Times New Roman" w:cs="Times New Roman"/>
+                <w:sz w:val="20"/>
+                <w:szCs w:val="20"/>
+              </w:rPr>
+              <w:t xml:space="preserve">24,8 млн ₽</w:t>
+            </w:r>
+          </w:p>
+        </w:tc>
+        <w:tc>
+          <w:tcPr>
+            <w:tcW w:w="3000" w:type="dxa"/>
+            <w:tcBorders>
+              <w:top w:val="single" w:sz="4" w:space="0" w:color="000000"/>
+              <w:start w:val="single" w:sz="4" w:space="0" w:color="000000"/>
+              <w:bottom w:val="single" w:sz="4" w:space="0" w:color="000000"/>
+              <w:end w:val="single" w:sz="4" w:space="0" w:color="000000"/>
+            </w:tcBorders>
+          </w:tcPr>
+          <w:p>
+            <w:pPr>
+              <w:pStyle w:val="Normal"/>
+              <w:spacing w:lineRule="auto" w:line="240" w:before="0" w:after="0"/>
+              <w:jc w:val="start"/>
+            </w:pPr>
+            <w:r>
+              <w:rPr>
+                <w:rFonts w:ascii="Times New Roman" w:hAnsi="Times New Roman" w:cs="Times New Roman"/>
+                <w:sz w:val="20"/>
+                <w:szCs w:val="20"/>
+              </w:rPr>
+              <w:t xml:space="preserve">99 чел.-мес</w:t>
+            </w:r>
+          </w:p>
+        </w:tc>
+        <w:tc>
+          <w:tcPr>
+            <w:tcW w:w="3100" w:type="dxa"/>
+            <w:tcBorders>
+              <w:top w:val="single" w:sz="4" w:space="0" w:color="000000"/>
+              <w:start w:val="single" w:sz="4" w:space="0" w:color="000000"/>
+              <w:bottom w:val="single" w:sz="4" w:space="0" w:color="000000"/>
+              <w:end w:val="single" w:sz="4" w:space="0" w:color="000000"/>
+            </w:tcBorders>
+          </w:tcPr>
+          <w:p>
+            <w:pPr>
+              <w:pStyle w:val="Normal"/>
+              <w:spacing w:lineRule="auto" w:line="240" w:before="0" w:after="0"/>
+              <w:jc w:val="start"/>
+            </w:pPr>
+            <w:r>
+              <w:rPr>
+                <w:rFonts w:ascii="Times New Roman" w:hAnsi="Times New Roman" w:cs="Times New Roman"/>
+                <w:sz w:val="20"/>
+                <w:szCs w:val="20"/>
+              </w:rPr>
+              <w:t xml:space="preserve">17,9 млн ₽</w:t>
             </w:r>
           </w:p>
         </w:tc>
@@ -7272,7 +7369,7 @@
           <w:sz w:val="24"/>
           <w:szCs w:val="24"/>
         </w:rPr>
-        <w:t xml:space="preserve">Итог. Совокупность рассмотренных наборов весов и вариантов базы даёт диапазон согласованных значений рыночной стоимости исключительного права от 10,1 до 17,2 млн ₽ при центральном значении 13,0 млн ₽. Выбор конкретной величины в пределах указанного диапазона определяется весами, принятыми оценщиком, и относится к его компетенции.</w:t>
+        <w:t xml:space="preserve">Итог. При принятой базе затратного подхода диапазон согласованных значений рыночной стоимости исключительного права составляет от 12,0 до 15,4 млн ₽ при центральном значении 13,7 млн ₽. Учёт верхней границы трудозатрат расширяет диапазон до 17,9 млн ₽. Выбор конкретной величины определяется весами, принятыми оценщиком, и относится к его компетенции.</w:t>
       </w:r>
     </w:p>
     <w:p>
@@ -7307,7 +7404,25 @@
           <w:sz w:val="24"/>
           <w:szCs w:val="24"/>
         </w:rPr>
-        <w:t xml:space="preserve">Величина трудозатрат (17 человеко-месяцев) получена расчётом как произведение календарной продолжительности разработки на численность персонала и является верхней границей. Фактическая величина подлежит подтверждению правообладателем.</w:t>
+        <w:t xml:space="preserve">Трудозатраты определены нормативным методом по объёму исходного текста, поскольку документально подтверждённый учёт рабочего времени по проекту не предоставлен. Принятые нормы выработки (1 500–2 500 строк на человеко-месяц для прикладного кода и 3 000–4 000 — для автоматических тестов) являются типовыми отраслевыми величинами и при наличии у правообладателя первичных документов подлежат замене на фактические данные.</w:t>
+      </w:r>
+    </w:p>
+    <w:p>
+      <w:pPr>
+        <w:pStyle w:val="ListParagraph"/>
+        <w:numPr>
+          <w:ilvl w:val="0"/>
+          <w:numId w:val="1"/>
+        </w:numPr>
+        <w:jc w:val="both"/>
+      </w:pPr>
+      <w:r>
+        <w:rPr>
+          <w:rFonts w:ascii="Times New Roman" w:hAnsi="Times New Roman" w:cs="Times New Roman"/>
+          <w:sz w:val="24"/>
+          <w:szCs w:val="24"/>
+        </w:rPr>
+        <w:t xml:space="preserve">Объём исходного текста определён автоматизированным подсчётом по репозиторию с исключением сторонних библиотек, результатов сборки и резервных копий файлов. Подсчёт может быть воспроизведён и проверен.</w:t>
       </w:r>
     </w:p>
     <w:p>

</xml_diff>